<commit_message>
Corregir equivalencias de Gobierno Interior y actualizar PDF/Word.
Sincroniza articulos.json y archivos desde sitio_consulta; corrige el desfase desde el articulo 193 del Codigo y agrega correspondencias 186-192.

Co-authored-by: Cursor <cursoragent@cursor.com>
</commit_message>
<xml_diff>
--- a/docx/Reglamento_Gobierno_Interior_Pabellon.docx
+++ b/docx/Reglamento_Gobierno_Interior_Pabellon.docx
@@ -9580,23 +9580,53 @@
         <w:jc w:val="both"/>
       </w:pPr>
       <w:r>
-        <w:t xml:space="preserve">XIV.- Subdelegación del INAPAM, y</w:t>
-      </w:r>
-    </w:p>
-    <w:p>
-      <w:pPr>
-        <w:spacing w:after="80"/>
-        <w:ind w:left="720" w:hanging="360"/>
-        <w:jc w:val="both"/>
-      </w:pPr>
-      <w:r>
-        <w:t xml:space="preserve">XV.- Instituto Municipal de Biodiversidad y Protección Ambiental.</w:t>
-      </w:r>
-    </w:p>
-    <w:p>
-      <w:pPr>
-        <w:spacing w:after="150"/>
-      </w:pPr>
+        <w:t>XIV.- Subdelegación del INAPAM;</w:t>
+      </w:r>
+    </w:p>
+    <w:p>
+      <w:pPr>
+        <w:spacing w:after="80"/>
+        <w:ind w:left="720" w:hanging="360"/>
+        <w:jc w:val="both"/>
+      </w:pPr>
+      <w:r>
+        <w:t>XV.- Instituto Municipal de Biodiversidad y Protección Ambiental, y</w:t>
+      </w:r>
+    </w:p>
+    <w:p>
+      <w:pPr>
+        <w:spacing w:after="150"/>
+      </w:pPr>
+    </w:p>
+    <w:p>
+      <w:pPr>
+        <w:spacing w:after="150"/>
+        <w:jc w:val="both"/>
+      </w:pPr>
+      <w:r>
+        <w:rPr>
+          <w:b/>
+          <w:bCs/>
+        </w:rPr>
+        <w:t>XVI.- Instituto Municipal de Salud Mental de Pabellón de Arteaga.</w:t>
+      </w:r>
+      <w:r/>
+    </w:p>
+    <w:p>
+      <w:pPr>
+        <w:spacing w:after="150"/>
+        <w:jc w:val="both"/>
+      </w:pPr>
+      <w:r>
+        <w:rPr>
+          <w:b/>
+          <w:bCs/>
+          <w:i/>
+          <w:color w:val="666666"/>
+          <w:sz w:val="18"/>
+        </w:rPr>
+        <w:t>Nota editorial (adición de trazabilidad, agosto 2026): se agrega el Instituto Municipal de Salud Mental de Pabellón de Arteaga como fracción XVI del catálogo de dependencias, dependencia que ya contaba con su propio capítulo de atribuciones (Sección Décima Sexta) y con departamentos asignados en el artículo siguiente, pero que por una omisión no figuraba en este artículo 212.</w:t>
+      </w:r>
     </w:p>
     <w:p>
       <w:pPr>
@@ -11669,7 +11699,24 @@
           <w:i/>
           <w:iCs/>
         </w:rPr>
-        <w:t xml:space="preserve">Sección CUARTA. De la Dirección General de Asuntos Jurídicos</w:t>
+        <w:t>Sección CUARTA. De la Dirección Jurídica</w:t>
+      </w:r>
+    </w:p>
+    <w:p>
+      <w:pPr>
+        <w:spacing w:after="150" w:before="200"/>
+        <w:jc w:val="center"/>
+      </w:pPr>
+      <w:r>
+        <w:rPr>
+          <w:b/>
+          <w:bCs/>
+          <w:i/>
+          <w:iCs/>
+          <w:color w:val="666666"/>
+          <w:sz w:val="18"/>
+        </w:rPr>
+        <w:t>Nota editorial (armonización de nombre, agosto 2026): se unifica la denominación de esta dependencia como "Dirección Jurídica", nombre usado de manera consistente en el resto del Reglamento y en el Bando, en vez de "Dirección General de Asuntos Jurídicos", denominación con la que aparecía únicamente en esta Sección y en el Código Municipal.</w:t>
       </w:r>
     </w:p>
     <w:p>
@@ -11685,7 +11732,7 @@
         <w:t xml:space="preserve">Artículo 228.- </w:t>
       </w:r>
       <w:r>
-        <w:t xml:space="preserve">Corresponde a la Dirección General de Asuntos Jurídicos:</w:t>
+        <w:t>Corresponde a la Dirección Jurídica:</w:t>
       </w:r>
     </w:p>
     <w:p>
@@ -11785,7 +11832,7 @@
         <w:jc w:val="both"/>
       </w:pPr>
       <w:r>
-        <w:t xml:space="preserve">X.- Lo demás que señalen la Ley, el presente Reglamento o le encomiende el H: Ayuntamiento por conducto del Presidente Municipal. (F. DE E., P.O. 13 DE FEBRERO DE 2023) Para garantizar la uniformidad y congruencia de la acción jurídica de la administración municipal y todas las áreas jurídicas que la conforman, así como la expedites en la atención de los asuntos y la economía en el uso de los recursos, todas las áreas de la administración pública municipal, centralizada o paramunicipal que dentro de su estructura cuenten con una instancia jurídica, ésta se subordinará jerárquica y administrativamente en su función técnica, operativa y administrativa directamente a los lineamientos y criterios que determine la Dirección General de Asuntos Jurídicos, a través de los mecanismos adecuados para el logro de los fines previstos en este artículo. Este mismo criterio aplicará para los servicios jurídicos especializados que llegaren a contratarse por parte de la administración municipal, los cuales serán valorados por esta Dirección, la Secretaría del Ayuntamiento y por conducto del Presidente Municipal.</w:t>
+        <w:t>X.- Lo demás que señalen la Ley, el presente Reglamento o le encomiende el H: Ayuntamiento por conducto del Presidente Municipal. (F. DE E., P.O. 13 DE FEBRERO DE 2023) Para garantizar la uniformidad y congruencia de la acción jurídica de la administración municipal y todas las áreas jurídicas que la conforman, así como la expedites en la atención de los asuntos y la economía en el uso de los recursos, todas las áreas de la administración pública municipal, centralizada o paramunicipal que dentro de su estructura cuenten con una instancia jurídica, ésta se subordinará jerárquica y administrativamente en su función técnica, operativa y administrativa directamente a los lineamientos y criterios que determine la Dirección Jurídica, a través de los mecanismos adecuados para el logro de los fines previstos en este artículo. Este mismo criterio aplicará para los servicios jurídicos especializados que llegaren a contratarse por parte de la administración municipal, los cuales serán valorados por esta Dirección, la Secretaría del Ayuntamiento y por conducto del Presidente Municipal.</w:t>
       </w:r>
     </w:p>
     <w:p>
@@ -22492,6 +22539,160 @@
           </w:tcPr>
           <w:p>
             <w:r>
+              <w:t>186</w:t>
+            </w:r>
+          </w:p>
+        </w:tc>
+        <w:tc>
+          <w:tcPr>
+            <w:tcW w:type="dxa" w:w="4500"/>
+          </w:tcPr>
+          <w:p>
+            <w:r>
+              <w:t>201</w:t>
+            </w:r>
+          </w:p>
+        </w:tc>
+      </w:tr>
+      <w:tr>
+        <w:tc>
+          <w:tcPr>
+            <w:tcW w:type="dxa" w:w="4500"/>
+          </w:tcPr>
+          <w:p>
+            <w:r>
+              <w:t>187</w:t>
+            </w:r>
+          </w:p>
+        </w:tc>
+        <w:tc>
+          <w:tcPr>
+            <w:tcW w:type="dxa" w:w="4500"/>
+          </w:tcPr>
+          <w:p>
+            <w:r>
+              <w:t>202</w:t>
+            </w:r>
+          </w:p>
+        </w:tc>
+      </w:tr>
+      <w:tr>
+        <w:tc>
+          <w:tcPr>
+            <w:tcW w:type="dxa" w:w="4500"/>
+          </w:tcPr>
+          <w:p>
+            <w:r>
+              <w:t>188</w:t>
+            </w:r>
+          </w:p>
+        </w:tc>
+        <w:tc>
+          <w:tcPr>
+            <w:tcW w:type="dxa" w:w="4500"/>
+          </w:tcPr>
+          <w:p>
+            <w:r>
+              <w:t>203</w:t>
+            </w:r>
+          </w:p>
+        </w:tc>
+      </w:tr>
+      <w:tr>
+        <w:tc>
+          <w:tcPr>
+            <w:tcW w:type="dxa" w:w="4500"/>
+          </w:tcPr>
+          <w:p>
+            <w:r>
+              <w:t>189</w:t>
+            </w:r>
+          </w:p>
+        </w:tc>
+        <w:tc>
+          <w:tcPr>
+            <w:tcW w:type="dxa" w:w="4500"/>
+          </w:tcPr>
+          <w:p>
+            <w:r>
+              <w:t>203</w:t>
+            </w:r>
+          </w:p>
+        </w:tc>
+      </w:tr>
+      <w:tr>
+        <w:tc>
+          <w:tcPr>
+            <w:tcW w:type="dxa" w:w="4500"/>
+          </w:tcPr>
+          <w:p>
+            <w:r>
+              <w:t>190</w:t>
+            </w:r>
+          </w:p>
+        </w:tc>
+        <w:tc>
+          <w:tcPr>
+            <w:tcW w:type="dxa" w:w="4500"/>
+          </w:tcPr>
+          <w:p>
+            <w:r>
+              <w:t>204</w:t>
+            </w:r>
+          </w:p>
+        </w:tc>
+      </w:tr>
+      <w:tr>
+        <w:tc>
+          <w:tcPr>
+            <w:tcW w:type="dxa" w:w="4500"/>
+          </w:tcPr>
+          <w:p>
+            <w:r>
+              <w:t>191</w:t>
+            </w:r>
+          </w:p>
+        </w:tc>
+        <w:tc>
+          <w:tcPr>
+            <w:tcW w:type="dxa" w:w="4500"/>
+          </w:tcPr>
+          <w:p>
+            <w:r>
+              <w:t>205</w:t>
+            </w:r>
+          </w:p>
+        </w:tc>
+      </w:tr>
+      <w:tr>
+        <w:tc>
+          <w:tcPr>
+            <w:tcW w:type="dxa" w:w="4500"/>
+          </w:tcPr>
+          <w:p>
+            <w:r>
+              <w:t>192</w:t>
+            </w:r>
+          </w:p>
+        </w:tc>
+        <w:tc>
+          <w:tcPr>
+            <w:tcW w:type="dxa" w:w="4500"/>
+          </w:tcPr>
+          <w:p>
+            <w:r>
+              <w:t>203</w:t>
+            </w:r>
+          </w:p>
+        </w:tc>
+      </w:tr>
+      <w:tr>
+        <w:tc>
+          <w:tcPr>
+            <w:tcW w:type="dxa" w:w="4500"/>
+          </w:tcPr>
+          <w:p>
+            <w:r>
               <w:t xml:space="preserve">193</w:t>
             </w:r>
           </w:p>
@@ -22502,22 +22703,188 @@
           </w:tcPr>
           <w:p>
             <w:r>
+              <w:t>206</w:t>
+            </w:r>
+          </w:p>
+        </w:tc>
+      </w:tr>
+      <w:tr>
+        <w:tc>
+          <w:tcPr>
+            <w:tcW w:type="dxa" w:w="4500"/>
+          </w:tcPr>
+          <w:p>
+            <w:r>
+              <w:t xml:space="preserve">194</w:t>
+            </w:r>
+          </w:p>
+        </w:tc>
+        <w:tc>
+          <w:tcPr>
+            <w:tcW w:type="dxa" w:w="4500"/>
+          </w:tcPr>
+          <w:p>
+            <w:r>
+              <w:t>207</w:t>
+            </w:r>
+          </w:p>
+        </w:tc>
+      </w:tr>
+      <w:tr>
+        <w:tc>
+          <w:tcPr>
+            <w:tcW w:type="dxa" w:w="4500"/>
+          </w:tcPr>
+          <w:p>
+            <w:r>
+              <w:t xml:space="preserve">195</w:t>
+            </w:r>
+          </w:p>
+        </w:tc>
+        <w:tc>
+          <w:tcPr>
+            <w:tcW w:type="dxa" w:w="4500"/>
+          </w:tcPr>
+          <w:p>
+            <w:r>
+              <w:t>208</w:t>
+            </w:r>
+          </w:p>
+        </w:tc>
+      </w:tr>
+      <w:tr>
+        <w:tc>
+          <w:tcPr>
+            <w:tcW w:type="dxa" w:w="4500"/>
+          </w:tcPr>
+          <w:p>
+            <w:r>
+              <w:t xml:space="preserve">196</w:t>
+            </w:r>
+          </w:p>
+        </w:tc>
+        <w:tc>
+          <w:tcPr>
+            <w:tcW w:type="dxa" w:w="4500"/>
+          </w:tcPr>
+          <w:p>
+            <w:r>
+              <w:t>209</w:t>
+            </w:r>
+          </w:p>
+        </w:tc>
+      </w:tr>
+      <w:tr>
+        <w:tc>
+          <w:tcPr>
+            <w:tcW w:type="dxa" w:w="4500"/>
+          </w:tcPr>
+          <w:p>
+            <w:r>
+              <w:t xml:space="preserve">197</w:t>
+            </w:r>
+          </w:p>
+        </w:tc>
+        <w:tc>
+          <w:tcPr>
+            <w:tcW w:type="dxa" w:w="4500"/>
+          </w:tcPr>
+          <w:p>
+            <w:r>
+              <w:t>210</w:t>
+            </w:r>
+          </w:p>
+        </w:tc>
+      </w:tr>
+      <w:tr>
+        <w:tc>
+          <w:tcPr>
+            <w:tcW w:type="dxa" w:w="4500"/>
+          </w:tcPr>
+          <w:p>
+            <w:r>
+              <w:t xml:space="preserve">198</w:t>
+            </w:r>
+          </w:p>
+        </w:tc>
+        <w:tc>
+          <w:tcPr>
+            <w:tcW w:type="dxa" w:w="4500"/>
+          </w:tcPr>
+          <w:p>
+            <w:r>
+              <w:t>211</w:t>
+            </w:r>
+          </w:p>
+        </w:tc>
+      </w:tr>
+      <w:tr>
+        <w:tc>
+          <w:tcPr>
+            <w:tcW w:type="dxa" w:w="4500"/>
+          </w:tcPr>
+          <w:p>
+            <w:r>
+              <w:t xml:space="preserve">199</w:t>
+            </w:r>
+          </w:p>
+        </w:tc>
+        <w:tc>
+          <w:tcPr>
+            <w:tcW w:type="dxa" w:w="4500"/>
+          </w:tcPr>
+          <w:p>
+            <w:r>
+              <w:t>212</w:t>
+            </w:r>
+          </w:p>
+        </w:tc>
+      </w:tr>
+      <w:tr>
+        <w:tc>
+          <w:tcPr>
+            <w:tcW w:type="dxa" w:w="4500"/>
+          </w:tcPr>
+          <w:p>
+            <w:r>
+              <w:t xml:space="preserve">200</w:t>
+            </w:r>
+          </w:p>
+        </w:tc>
+        <w:tc>
+          <w:tcPr>
+            <w:tcW w:type="dxa" w:w="4500"/>
+          </w:tcPr>
+          <w:p>
+            <w:r>
+              <w:t>213</w:t>
+            </w:r>
+          </w:p>
+        </w:tc>
+      </w:tr>
+      <w:tr>
+        <w:tc>
+          <w:tcPr>
+            <w:tcW w:type="dxa" w:w="4500"/>
+          </w:tcPr>
+          <w:p>
+            <w:r>
               <w:t xml:space="preserve">201</w:t>
             </w:r>
           </w:p>
         </w:tc>
-      </w:tr>
-      <w:tr>
-        <w:tc>
-          <w:tcPr>
-            <w:tcW w:type="dxa" w:w="4500"/>
-          </w:tcPr>
-          <w:p>
-            <w:r>
-              <w:t xml:space="preserve">194</w:t>
-            </w:r>
-          </w:p>
-        </w:tc>
+        <w:tc>
+          <w:tcPr>
+            <w:tcW w:type="dxa" w:w="4500"/>
+          </w:tcPr>
+          <w:p>
+            <w:r>
+              <w:t>214</w:t>
+            </w:r>
+          </w:p>
+        </w:tc>
+      </w:tr>
+      <w:tr>
         <w:tc>
           <w:tcPr>
             <w:tcW w:type="dxa" w:w="4500"/>
@@ -22528,18 +22895,18 @@
             </w:r>
           </w:p>
         </w:tc>
-      </w:tr>
-      <w:tr>
-        <w:tc>
-          <w:tcPr>
-            <w:tcW w:type="dxa" w:w="4500"/>
-          </w:tcPr>
-          <w:p>
-            <w:r>
-              <w:t xml:space="preserve">195</w:t>
-            </w:r>
-          </w:p>
-        </w:tc>
+        <w:tc>
+          <w:tcPr>
+            <w:tcW w:type="dxa" w:w="4500"/>
+          </w:tcPr>
+          <w:p>
+            <w:r>
+              <w:t>215</w:t>
+            </w:r>
+          </w:p>
+        </w:tc>
+      </w:tr>
+      <w:tr>
         <w:tc>
           <w:tcPr>
             <w:tcW w:type="dxa" w:w="4500"/>
@@ -22550,18 +22917,18 @@
             </w:r>
           </w:p>
         </w:tc>
-      </w:tr>
-      <w:tr>
-        <w:tc>
-          <w:tcPr>
-            <w:tcW w:type="dxa" w:w="4500"/>
-          </w:tcPr>
-          <w:p>
-            <w:r>
-              <w:t xml:space="preserve">196</w:t>
-            </w:r>
-          </w:p>
-        </w:tc>
+        <w:tc>
+          <w:tcPr>
+            <w:tcW w:type="dxa" w:w="4500"/>
+          </w:tcPr>
+          <w:p>
+            <w:r>
+              <w:t>216</w:t>
+            </w:r>
+          </w:p>
+        </w:tc>
+      </w:tr>
+      <w:tr>
         <w:tc>
           <w:tcPr>
             <w:tcW w:type="dxa" w:w="4500"/>
@@ -22572,18 +22939,18 @@
             </w:r>
           </w:p>
         </w:tc>
-      </w:tr>
-      <w:tr>
-        <w:tc>
-          <w:tcPr>
-            <w:tcW w:type="dxa" w:w="4500"/>
-          </w:tcPr>
-          <w:p>
-            <w:r>
-              <w:t xml:space="preserve">197</w:t>
-            </w:r>
-          </w:p>
-        </w:tc>
+        <w:tc>
+          <w:tcPr>
+            <w:tcW w:type="dxa" w:w="4500"/>
+          </w:tcPr>
+          <w:p>
+            <w:r>
+              <w:t>217</w:t>
+            </w:r>
+          </w:p>
+        </w:tc>
+      </w:tr>
+      <w:tr>
         <w:tc>
           <w:tcPr>
             <w:tcW w:type="dxa" w:w="4500"/>
@@ -22594,18 +22961,18 @@
             </w:r>
           </w:p>
         </w:tc>
-      </w:tr>
-      <w:tr>
-        <w:tc>
-          <w:tcPr>
-            <w:tcW w:type="dxa" w:w="4500"/>
-          </w:tcPr>
-          <w:p>
-            <w:r>
-              <w:t xml:space="preserve">198</w:t>
-            </w:r>
-          </w:p>
-        </w:tc>
+        <w:tc>
+          <w:tcPr>
+            <w:tcW w:type="dxa" w:w="4500"/>
+          </w:tcPr>
+          <w:p>
+            <w:r>
+              <w:t>218</w:t>
+            </w:r>
+          </w:p>
+        </w:tc>
+      </w:tr>
+      <w:tr>
         <w:tc>
           <w:tcPr>
             <w:tcW w:type="dxa" w:w="4500"/>
@@ -22616,18 +22983,18 @@
             </w:r>
           </w:p>
         </w:tc>
-      </w:tr>
-      <w:tr>
-        <w:tc>
-          <w:tcPr>
-            <w:tcW w:type="dxa" w:w="4500"/>
-          </w:tcPr>
-          <w:p>
-            <w:r>
-              <w:t xml:space="preserve">199</w:t>
-            </w:r>
-          </w:p>
-        </w:tc>
+        <w:tc>
+          <w:tcPr>
+            <w:tcW w:type="dxa" w:w="4500"/>
+          </w:tcPr>
+          <w:p>
+            <w:r>
+              <w:t>219</w:t>
+            </w:r>
+          </w:p>
+        </w:tc>
+      </w:tr>
+      <w:tr>
         <w:tc>
           <w:tcPr>
             <w:tcW w:type="dxa" w:w="4500"/>
@@ -22638,18 +23005,18 @@
             </w:r>
           </w:p>
         </w:tc>
-      </w:tr>
-      <w:tr>
-        <w:tc>
-          <w:tcPr>
-            <w:tcW w:type="dxa" w:w="4500"/>
-          </w:tcPr>
-          <w:p>
-            <w:r>
-              <w:t xml:space="preserve">200</w:t>
-            </w:r>
-          </w:p>
-        </w:tc>
+        <w:tc>
+          <w:tcPr>
+            <w:tcW w:type="dxa" w:w="4500"/>
+          </w:tcPr>
+          <w:p>
+            <w:r>
+              <w:t>220</w:t>
+            </w:r>
+          </w:p>
+        </w:tc>
+      </w:tr>
+      <w:tr>
         <w:tc>
           <w:tcPr>
             <w:tcW w:type="dxa" w:w="4500"/>
@@ -22660,18 +23027,18 @@
             </w:r>
           </w:p>
         </w:tc>
-      </w:tr>
-      <w:tr>
-        <w:tc>
-          <w:tcPr>
-            <w:tcW w:type="dxa" w:w="4500"/>
-          </w:tcPr>
-          <w:p>
-            <w:r>
-              <w:t xml:space="preserve">201</w:t>
-            </w:r>
-          </w:p>
-        </w:tc>
+        <w:tc>
+          <w:tcPr>
+            <w:tcW w:type="dxa" w:w="4500"/>
+          </w:tcPr>
+          <w:p>
+            <w:r>
+              <w:t>221</w:t>
+            </w:r>
+          </w:p>
+        </w:tc>
+      </w:tr>
+      <w:tr>
         <w:tc>
           <w:tcPr>
             <w:tcW w:type="dxa" w:w="4500"/>
@@ -22682,40 +23049,40 @@
             </w:r>
           </w:p>
         </w:tc>
-      </w:tr>
-      <w:tr>
-        <w:tc>
-          <w:tcPr>
-            <w:tcW w:type="dxa" w:w="4500"/>
-          </w:tcPr>
-          <w:p>
-            <w:r>
-              <w:t xml:space="preserve">202</w:t>
-            </w:r>
-          </w:p>
-        </w:tc>
-        <w:tc>
-          <w:tcPr>
-            <w:tcW w:type="dxa" w:w="4500"/>
-          </w:tcPr>
-          <w:p>
-            <w:r>
-              <w:t xml:space="preserve">210</w:t>
-            </w:r>
-          </w:p>
-        </w:tc>
-      </w:tr>
-      <w:tr>
-        <w:tc>
-          <w:tcPr>
-            <w:tcW w:type="dxa" w:w="4500"/>
-          </w:tcPr>
-          <w:p>
-            <w:r>
-              <w:t xml:space="preserve">203</w:t>
-            </w:r>
-          </w:p>
-        </w:tc>
+        <w:tc>
+          <w:tcPr>
+            <w:tcW w:type="dxa" w:w="4500"/>
+          </w:tcPr>
+          <w:p>
+            <w:r>
+              <w:t>222</w:t>
+            </w:r>
+          </w:p>
+        </w:tc>
+      </w:tr>
+      <w:tr>
+        <w:tc>
+          <w:tcPr>
+            <w:tcW w:type="dxa" w:w="4500"/>
+          </w:tcPr>
+          <w:p>
+            <w:r>
+              <w:t xml:space="preserve">209 BIS</w:t>
+            </w:r>
+          </w:p>
+        </w:tc>
+        <w:tc>
+          <w:tcPr>
+            <w:tcW w:type="dxa" w:w="4500"/>
+          </w:tcPr>
+          <w:p>
+            <w:r>
+              <w:t>223</w:t>
+            </w:r>
+          </w:p>
+        </w:tc>
+      </w:tr>
+      <w:tr>
         <w:tc>
           <w:tcPr>
             <w:tcW w:type="dxa" w:w="4500"/>
@@ -22726,40 +23093,18 @@
             </w:r>
           </w:p>
         </w:tc>
-      </w:tr>
-      <w:tr>
-        <w:tc>
-          <w:tcPr>
-            <w:tcW w:type="dxa" w:w="4500"/>
-          </w:tcPr>
-          <w:p>
-            <w:r>
-              <w:t xml:space="preserve">204</w:t>
-            </w:r>
-          </w:p>
-        </w:tc>
-        <w:tc>
-          <w:tcPr>
-            <w:tcW w:type="dxa" w:w="4500"/>
-          </w:tcPr>
-          <w:p>
-            <w:r>
-              <w:t xml:space="preserve">212</w:t>
-            </w:r>
-          </w:p>
-        </w:tc>
-      </w:tr>
-      <w:tr>
-        <w:tc>
-          <w:tcPr>
-            <w:tcW w:type="dxa" w:w="4500"/>
-          </w:tcPr>
-          <w:p>
-            <w:r>
-              <w:t xml:space="preserve">205</w:t>
-            </w:r>
-          </w:p>
-        </w:tc>
+        <w:tc>
+          <w:tcPr>
+            <w:tcW w:type="dxa" w:w="4500"/>
+          </w:tcPr>
+          <w:p>
+            <w:r>
+              <w:t>224</w:t>
+            </w:r>
+          </w:p>
+        </w:tc>
+      </w:tr>
+      <w:tr>
         <w:tc>
           <w:tcPr>
             <w:tcW w:type="dxa" w:w="4500"/>
@@ -22770,18 +23115,18 @@
             </w:r>
           </w:p>
         </w:tc>
-      </w:tr>
-      <w:tr>
-        <w:tc>
-          <w:tcPr>
-            <w:tcW w:type="dxa" w:w="4500"/>
-          </w:tcPr>
-          <w:p>
-            <w:r>
-              <w:t xml:space="preserve">206</w:t>
-            </w:r>
-          </w:p>
-        </w:tc>
+        <w:tc>
+          <w:tcPr>
+            <w:tcW w:type="dxa" w:w="4500"/>
+          </w:tcPr>
+          <w:p>
+            <w:r>
+              <w:t>225</w:t>
+            </w:r>
+          </w:p>
+        </w:tc>
+      </w:tr>
+      <w:tr>
         <w:tc>
           <w:tcPr>
             <w:tcW w:type="dxa" w:w="4500"/>
@@ -22792,18 +23137,18 @@
             </w:r>
           </w:p>
         </w:tc>
-      </w:tr>
-      <w:tr>
-        <w:tc>
-          <w:tcPr>
-            <w:tcW w:type="dxa" w:w="4500"/>
-          </w:tcPr>
-          <w:p>
-            <w:r>
-              <w:t xml:space="preserve">207</w:t>
-            </w:r>
-          </w:p>
-        </w:tc>
+        <w:tc>
+          <w:tcPr>
+            <w:tcW w:type="dxa" w:w="4500"/>
+          </w:tcPr>
+          <w:p>
+            <w:r>
+              <w:t>226</w:t>
+            </w:r>
+          </w:p>
+        </w:tc>
+      </w:tr>
+      <w:tr>
         <w:tc>
           <w:tcPr>
             <w:tcW w:type="dxa" w:w="4500"/>
@@ -22814,18 +23159,18 @@
             </w:r>
           </w:p>
         </w:tc>
-      </w:tr>
-      <w:tr>
-        <w:tc>
-          <w:tcPr>
-            <w:tcW w:type="dxa" w:w="4500"/>
-          </w:tcPr>
-          <w:p>
-            <w:r>
-              <w:t xml:space="preserve">208</w:t>
-            </w:r>
-          </w:p>
-        </w:tc>
+        <w:tc>
+          <w:tcPr>
+            <w:tcW w:type="dxa" w:w="4500"/>
+          </w:tcPr>
+          <w:p>
+            <w:r>
+              <w:t>227</w:t>
+            </w:r>
+          </w:p>
+        </w:tc>
+      </w:tr>
+      <w:tr>
         <w:tc>
           <w:tcPr>
             <w:tcW w:type="dxa" w:w="4500"/>
@@ -22836,40 +23181,84 @@
             </w:r>
           </w:p>
         </w:tc>
-      </w:tr>
-      <w:tr>
-        <w:tc>
-          <w:tcPr>
-            <w:tcW w:type="dxa" w:w="4500"/>
-          </w:tcPr>
-          <w:p>
-            <w:r>
-              <w:t xml:space="preserve">209</w:t>
-            </w:r>
-          </w:p>
-        </w:tc>
-        <w:tc>
-          <w:tcPr>
-            <w:tcW w:type="dxa" w:w="4500"/>
-          </w:tcPr>
-          <w:p>
-            <w:r>
-              <w:t xml:space="preserve">217</w:t>
-            </w:r>
-          </w:p>
-        </w:tc>
-      </w:tr>
-      <w:tr>
-        <w:tc>
-          <w:tcPr>
-            <w:tcW w:type="dxa" w:w="4500"/>
-          </w:tcPr>
-          <w:p>
-            <w:r>
-              <w:t xml:space="preserve">209 BIS</w:t>
-            </w:r>
-          </w:p>
-        </w:tc>
+        <w:tc>
+          <w:tcPr>
+            <w:tcW w:type="dxa" w:w="4500"/>
+          </w:tcPr>
+          <w:p>
+            <w:r>
+              <w:t>228</w:t>
+            </w:r>
+          </w:p>
+        </w:tc>
+      </w:tr>
+      <w:tr>
+        <w:tc>
+          <w:tcPr>
+            <w:tcW w:type="dxa" w:w="4500"/>
+          </w:tcPr>
+          <w:p>
+            <w:r>
+              <w:t xml:space="preserve">216 BIS</w:t>
+            </w:r>
+          </w:p>
+        </w:tc>
+        <w:tc>
+          <w:tcPr>
+            <w:tcW w:type="dxa" w:w="4500"/>
+          </w:tcPr>
+          <w:p>
+            <w:r>
+              <w:t>229</w:t>
+            </w:r>
+          </w:p>
+        </w:tc>
+      </w:tr>
+      <w:tr>
+        <w:tc>
+          <w:tcPr>
+            <w:tcW w:type="dxa" w:w="4500"/>
+          </w:tcPr>
+          <w:p>
+            <w:r>
+              <w:t xml:space="preserve">NUEVO</w:t>
+            </w:r>
+          </w:p>
+        </w:tc>
+        <w:tc>
+          <w:tcPr>
+            <w:tcW w:type="dxa" w:w="4500"/>
+          </w:tcPr>
+          <w:p>
+            <w:r>
+              <w:t>230</w:t>
+            </w:r>
+          </w:p>
+        </w:tc>
+      </w:tr>
+      <w:tr>
+        <w:tc>
+          <w:tcPr>
+            <w:tcW w:type="dxa" w:w="4500"/>
+          </w:tcPr>
+          <w:p>
+            <w:r>
+              <w:t xml:space="preserve">NUEVO</w:t>
+            </w:r>
+          </w:p>
+        </w:tc>
+        <w:tc>
+          <w:tcPr>
+            <w:tcW w:type="dxa" w:w="4500"/>
+          </w:tcPr>
+          <w:p>
+            <w:r>
+              <w:t>231</w:t>
+            </w:r>
+          </w:p>
+        </w:tc>
+      </w:tr>
+      <w:tr>
         <w:tc>
           <w:tcPr>
             <w:tcW w:type="dxa" w:w="4500"/>
@@ -22880,18 +23269,18 @@
             </w:r>
           </w:p>
         </w:tc>
-      </w:tr>
-      <w:tr>
-        <w:tc>
-          <w:tcPr>
-            <w:tcW w:type="dxa" w:w="4500"/>
-          </w:tcPr>
-          <w:p>
-            <w:r>
-              <w:t xml:space="preserve">211</w:t>
-            </w:r>
-          </w:p>
-        </w:tc>
+        <w:tc>
+          <w:tcPr>
+            <w:tcW w:type="dxa" w:w="4500"/>
+          </w:tcPr>
+          <w:p>
+            <w:r>
+              <w:t>232</w:t>
+            </w:r>
+          </w:p>
+        </w:tc>
+      </w:tr>
+      <w:tr>
         <w:tc>
           <w:tcPr>
             <w:tcW w:type="dxa" w:w="4500"/>
@@ -22902,18 +23291,40 @@
             </w:r>
           </w:p>
         </w:tc>
-      </w:tr>
-      <w:tr>
-        <w:tc>
-          <w:tcPr>
-            <w:tcW w:type="dxa" w:w="4500"/>
-          </w:tcPr>
-          <w:p>
-            <w:r>
-              <w:t xml:space="preserve">213</w:t>
-            </w:r>
-          </w:p>
-        </w:tc>
+        <w:tc>
+          <w:tcPr>
+            <w:tcW w:type="dxa" w:w="4500"/>
+          </w:tcPr>
+          <w:p>
+            <w:r>
+              <w:t>233</w:t>
+            </w:r>
+          </w:p>
+        </w:tc>
+      </w:tr>
+      <w:tr>
+        <w:tc>
+          <w:tcPr>
+            <w:tcW w:type="dxa" w:w="4500"/>
+          </w:tcPr>
+          <w:p>
+            <w:r>
+              <w:t xml:space="preserve">219 BIS</w:t>
+            </w:r>
+          </w:p>
+        </w:tc>
+        <w:tc>
+          <w:tcPr>
+            <w:tcW w:type="dxa" w:w="4500"/>
+          </w:tcPr>
+          <w:p>
+            <w:r>
+              <w:t>234</w:t>
+            </w:r>
+          </w:p>
+        </w:tc>
+      </w:tr>
+      <w:tr>
         <w:tc>
           <w:tcPr>
             <w:tcW w:type="dxa" w:w="4500"/>
@@ -22924,18 +23335,326 @@
             </w:r>
           </w:p>
         </w:tc>
-      </w:tr>
-      <w:tr>
-        <w:tc>
-          <w:tcPr>
-            <w:tcW w:type="dxa" w:w="4500"/>
-          </w:tcPr>
-          <w:p>
-            <w:r>
-              <w:t xml:space="preserve">214</w:t>
-            </w:r>
-          </w:p>
-        </w:tc>
+        <w:tc>
+          <w:tcPr>
+            <w:tcW w:type="dxa" w:w="4500"/>
+          </w:tcPr>
+          <w:p>
+            <w:r>
+              <w:t>235</w:t>
+            </w:r>
+          </w:p>
+        </w:tc>
+      </w:tr>
+      <w:tr>
+        <w:tc>
+          <w:tcPr>
+            <w:tcW w:type="dxa" w:w="4500"/>
+          </w:tcPr>
+          <w:p>
+            <w:r>
+              <w:t xml:space="preserve">220 BIS</w:t>
+            </w:r>
+          </w:p>
+        </w:tc>
+        <w:tc>
+          <w:tcPr>
+            <w:tcW w:type="dxa" w:w="4500"/>
+          </w:tcPr>
+          <w:p>
+            <w:r>
+              <w:t>236</w:t>
+            </w:r>
+          </w:p>
+        </w:tc>
+      </w:tr>
+      <w:tr>
+        <w:tc>
+          <w:tcPr>
+            <w:tcW w:type="dxa" w:w="4500"/>
+          </w:tcPr>
+          <w:p>
+            <w:r>
+              <w:t xml:space="preserve">220 TER</w:t>
+            </w:r>
+          </w:p>
+        </w:tc>
+        <w:tc>
+          <w:tcPr>
+            <w:tcW w:type="dxa" w:w="4500"/>
+          </w:tcPr>
+          <w:p>
+            <w:r>
+              <w:t>237</w:t>
+            </w:r>
+          </w:p>
+        </w:tc>
+      </w:tr>
+      <w:tr>
+        <w:tc>
+          <w:tcPr>
+            <w:tcW w:type="dxa" w:w="4500"/>
+          </w:tcPr>
+          <w:p>
+            <w:r>
+              <w:t xml:space="preserve">220 QUATER</w:t>
+            </w:r>
+          </w:p>
+        </w:tc>
+        <w:tc>
+          <w:tcPr>
+            <w:tcW w:type="dxa" w:w="4500"/>
+          </w:tcPr>
+          <w:p>
+            <w:r>
+              <w:t>238</w:t>
+            </w:r>
+          </w:p>
+        </w:tc>
+      </w:tr>
+      <w:tr>
+        <w:tc>
+          <w:tcPr>
+            <w:tcW w:type="dxa" w:w="4500"/>
+          </w:tcPr>
+          <w:p>
+            <w:r>
+              <w:t xml:space="preserve">220 QUINQUIES</w:t>
+            </w:r>
+          </w:p>
+        </w:tc>
+        <w:tc>
+          <w:tcPr>
+            <w:tcW w:type="dxa" w:w="4500"/>
+          </w:tcPr>
+          <w:p>
+            <w:r>
+              <w:t>239</w:t>
+            </w:r>
+          </w:p>
+        </w:tc>
+      </w:tr>
+      <w:tr>
+        <w:tc>
+          <w:tcPr>
+            <w:tcW w:type="dxa" w:w="4500"/>
+          </w:tcPr>
+          <w:p>
+            <w:r>
+              <w:t xml:space="preserve">220 SEXIES</w:t>
+            </w:r>
+          </w:p>
+        </w:tc>
+        <w:tc>
+          <w:tcPr>
+            <w:tcW w:type="dxa" w:w="4500"/>
+          </w:tcPr>
+          <w:p>
+            <w:r>
+              <w:t>240</w:t>
+            </w:r>
+          </w:p>
+        </w:tc>
+      </w:tr>
+      <w:tr>
+        <w:tc>
+          <w:tcPr>
+            <w:tcW w:type="dxa" w:w="4500"/>
+          </w:tcPr>
+          <w:p>
+            <w:r>
+              <w:t xml:space="preserve">220 SEPTIES</w:t>
+            </w:r>
+          </w:p>
+        </w:tc>
+        <w:tc>
+          <w:tcPr>
+            <w:tcW w:type="dxa" w:w="4500"/>
+          </w:tcPr>
+          <w:p>
+            <w:r>
+              <w:t>241</w:t>
+            </w:r>
+          </w:p>
+        </w:tc>
+      </w:tr>
+      <w:tr>
+        <w:tc>
+          <w:tcPr>
+            <w:tcW w:type="dxa" w:w="4500"/>
+          </w:tcPr>
+          <w:p>
+            <w:r>
+              <w:t xml:space="preserve">220 OCTIES</w:t>
+            </w:r>
+          </w:p>
+        </w:tc>
+        <w:tc>
+          <w:tcPr>
+            <w:tcW w:type="dxa" w:w="4500"/>
+          </w:tcPr>
+          <w:p>
+            <w:r>
+              <w:t>242</w:t>
+            </w:r>
+          </w:p>
+        </w:tc>
+      </w:tr>
+      <w:tr>
+        <w:tc>
+          <w:tcPr>
+            <w:tcW w:type="dxa" w:w="4500"/>
+          </w:tcPr>
+          <w:p>
+            <w:r>
+              <w:t xml:space="preserve">220 NOVIES</w:t>
+            </w:r>
+          </w:p>
+        </w:tc>
+        <w:tc>
+          <w:tcPr>
+            <w:tcW w:type="dxa" w:w="4500"/>
+          </w:tcPr>
+          <w:p>
+            <w:r>
+              <w:t>243</w:t>
+            </w:r>
+          </w:p>
+        </w:tc>
+      </w:tr>
+      <w:tr>
+        <w:tc>
+          <w:tcPr>
+            <w:tcW w:type="dxa" w:w="4500"/>
+          </w:tcPr>
+          <w:p>
+            <w:r>
+              <w:t xml:space="preserve">220 DECIES</w:t>
+            </w:r>
+          </w:p>
+        </w:tc>
+        <w:tc>
+          <w:tcPr>
+            <w:tcW w:type="dxa" w:w="4500"/>
+          </w:tcPr>
+          <w:p>
+            <w:r>
+              <w:t>244</w:t>
+            </w:r>
+          </w:p>
+        </w:tc>
+      </w:tr>
+      <w:tr>
+        <w:tc>
+          <w:tcPr>
+            <w:tcW w:type="dxa" w:w="4500"/>
+          </w:tcPr>
+          <w:p>
+            <w:r>
+              <w:t xml:space="preserve">220 UNDECIES</w:t>
+            </w:r>
+          </w:p>
+        </w:tc>
+        <w:tc>
+          <w:tcPr>
+            <w:tcW w:type="dxa" w:w="4500"/>
+          </w:tcPr>
+          <w:p>
+            <w:r>
+              <w:t>245</w:t>
+            </w:r>
+          </w:p>
+        </w:tc>
+      </w:tr>
+      <w:tr>
+        <w:tc>
+          <w:tcPr>
+            <w:tcW w:type="dxa" w:w="4500"/>
+          </w:tcPr>
+          <w:p>
+            <w:r>
+              <w:t xml:space="preserve">220 DUODECIES</w:t>
+            </w:r>
+          </w:p>
+        </w:tc>
+        <w:tc>
+          <w:tcPr>
+            <w:tcW w:type="dxa" w:w="4500"/>
+          </w:tcPr>
+          <w:p>
+            <w:r>
+              <w:t>246</w:t>
+            </w:r>
+          </w:p>
+        </w:tc>
+      </w:tr>
+      <w:tr>
+        <w:tc>
+          <w:tcPr>
+            <w:tcW w:type="dxa" w:w="4500"/>
+          </w:tcPr>
+          <w:p>
+            <w:r>
+              <w:t xml:space="preserve">220 TERDECIES</w:t>
+            </w:r>
+          </w:p>
+        </w:tc>
+        <w:tc>
+          <w:tcPr>
+            <w:tcW w:type="dxa" w:w="4500"/>
+          </w:tcPr>
+          <w:p>
+            <w:r>
+              <w:t>247</w:t>
+            </w:r>
+          </w:p>
+        </w:tc>
+      </w:tr>
+      <w:tr>
+        <w:tc>
+          <w:tcPr>
+            <w:tcW w:type="dxa" w:w="4500"/>
+          </w:tcPr>
+          <w:p>
+            <w:r>
+              <w:t xml:space="preserve">220 QUATERDECIES</w:t>
+            </w:r>
+          </w:p>
+        </w:tc>
+        <w:tc>
+          <w:tcPr>
+            <w:tcW w:type="dxa" w:w="4500"/>
+          </w:tcPr>
+          <w:p>
+            <w:r>
+              <w:t>248</w:t>
+            </w:r>
+          </w:p>
+        </w:tc>
+      </w:tr>
+      <w:tr>
+        <w:tc>
+          <w:tcPr>
+            <w:tcW w:type="dxa" w:w="4500"/>
+          </w:tcPr>
+          <w:p>
+            <w:r>
+              <w:t xml:space="preserve">220 QUINDECIES</w:t>
+            </w:r>
+          </w:p>
+        </w:tc>
+        <w:tc>
+          <w:tcPr>
+            <w:tcW w:type="dxa" w:w="4500"/>
+          </w:tcPr>
+          <w:p>
+            <w:r>
+              <w:t>249</w:t>
+            </w:r>
+          </w:p>
+        </w:tc>
+      </w:tr>
+      <w:tr>
         <w:tc>
           <w:tcPr>
             <w:tcW w:type="dxa" w:w="4500"/>
@@ -22946,18 +23665,40 @@
             </w:r>
           </w:p>
         </w:tc>
-      </w:tr>
-      <w:tr>
-        <w:tc>
-          <w:tcPr>
-            <w:tcW w:type="dxa" w:w="4500"/>
-          </w:tcPr>
-          <w:p>
-            <w:r>
-              <w:t xml:space="preserve">215</w:t>
-            </w:r>
-          </w:p>
-        </w:tc>
+        <w:tc>
+          <w:tcPr>
+            <w:tcW w:type="dxa" w:w="4500"/>
+          </w:tcPr>
+          <w:p>
+            <w:r>
+              <w:t>250</w:t>
+            </w:r>
+          </w:p>
+        </w:tc>
+      </w:tr>
+      <w:tr>
+        <w:tc>
+          <w:tcPr>
+            <w:tcW w:type="dxa" w:w="4500"/>
+          </w:tcPr>
+          <w:p>
+            <w:r>
+              <w:t xml:space="preserve">221 BIS</w:t>
+            </w:r>
+          </w:p>
+        </w:tc>
+        <w:tc>
+          <w:tcPr>
+            <w:tcW w:type="dxa" w:w="4500"/>
+          </w:tcPr>
+          <w:p>
+            <w:r>
+              <w:t>251</w:t>
+            </w:r>
+          </w:p>
+        </w:tc>
+      </w:tr>
+      <w:tr>
         <w:tc>
           <w:tcPr>
             <w:tcW w:type="dxa" w:w="4500"/>
@@ -22968,18 +23709,84 @@
             </w:r>
           </w:p>
         </w:tc>
-      </w:tr>
-      <w:tr>
-        <w:tc>
-          <w:tcPr>
-            <w:tcW w:type="dxa" w:w="4500"/>
-          </w:tcPr>
-          <w:p>
-            <w:r>
-              <w:t xml:space="preserve">216</w:t>
-            </w:r>
-          </w:p>
-        </w:tc>
+        <w:tc>
+          <w:tcPr>
+            <w:tcW w:type="dxa" w:w="4500"/>
+          </w:tcPr>
+          <w:p>
+            <w:r>
+              <w:t>252</w:t>
+            </w:r>
+          </w:p>
+        </w:tc>
+      </w:tr>
+      <w:tr>
+        <w:tc>
+          <w:tcPr>
+            <w:tcW w:type="dxa" w:w="4500"/>
+          </w:tcPr>
+          <w:p>
+            <w:r>
+              <w:t xml:space="preserve">222 TER</w:t>
+            </w:r>
+          </w:p>
+        </w:tc>
+        <w:tc>
+          <w:tcPr>
+            <w:tcW w:type="dxa" w:w="4500"/>
+          </w:tcPr>
+          <w:p>
+            <w:r>
+              <w:t>253</w:t>
+            </w:r>
+          </w:p>
+        </w:tc>
+      </w:tr>
+      <w:tr>
+        <w:tc>
+          <w:tcPr>
+            <w:tcW w:type="dxa" w:w="4500"/>
+          </w:tcPr>
+          <w:p>
+            <w:r>
+              <w:t xml:space="preserve">222 QUATER</w:t>
+            </w:r>
+          </w:p>
+        </w:tc>
+        <w:tc>
+          <w:tcPr>
+            <w:tcW w:type="dxa" w:w="4500"/>
+          </w:tcPr>
+          <w:p>
+            <w:r>
+              <w:t>254</w:t>
+            </w:r>
+          </w:p>
+        </w:tc>
+      </w:tr>
+      <w:tr>
+        <w:tc>
+          <w:tcPr>
+            <w:tcW w:type="dxa" w:w="4500"/>
+          </w:tcPr>
+          <w:p>
+            <w:r>
+              <w:t xml:space="preserve">222 QUINQUIES</w:t>
+            </w:r>
+          </w:p>
+        </w:tc>
+        <w:tc>
+          <w:tcPr>
+            <w:tcW w:type="dxa" w:w="4500"/>
+          </w:tcPr>
+          <w:p>
+            <w:r>
+              <w:t>255</w:t>
+            </w:r>
+          </w:p>
+        </w:tc>
+      </w:tr>
+      <w:tr>
         <w:tc>
           <w:tcPr>
             <w:tcW w:type="dxa" w:w="4500"/>
@@ -22990,18 +23797,18 @@
             </w:r>
           </w:p>
         </w:tc>
-      </w:tr>
-      <w:tr>
-        <w:tc>
-          <w:tcPr>
-            <w:tcW w:type="dxa" w:w="4500"/>
-          </w:tcPr>
-          <w:p>
-            <w:r>
-              <w:t xml:space="preserve">216 BIS</w:t>
-            </w:r>
-          </w:p>
-        </w:tc>
+        <w:tc>
+          <w:tcPr>
+            <w:tcW w:type="dxa" w:w="4500"/>
+          </w:tcPr>
+          <w:p>
+            <w:r>
+              <w:t>256</w:t>
+            </w:r>
+          </w:p>
+        </w:tc>
+      </w:tr>
+      <w:tr>
         <w:tc>
           <w:tcPr>
             <w:tcW w:type="dxa" w:w="4500"/>
@@ -23012,18 +23819,18 @@
             </w:r>
           </w:p>
         </w:tc>
-      </w:tr>
-      <w:tr>
-        <w:tc>
-          <w:tcPr>
-            <w:tcW w:type="dxa" w:w="4500"/>
-          </w:tcPr>
-          <w:p>
-            <w:r>
-              <w:t xml:space="preserve">NUEVO</w:t>
-            </w:r>
-          </w:p>
-        </w:tc>
+        <w:tc>
+          <w:tcPr>
+            <w:tcW w:type="dxa" w:w="4500"/>
+          </w:tcPr>
+          <w:p>
+            <w:r>
+              <w:t>257</w:t>
+            </w:r>
+          </w:p>
+        </w:tc>
+      </w:tr>
+      <w:tr>
         <w:tc>
           <w:tcPr>
             <w:tcW w:type="dxa" w:w="4500"/>
@@ -23034,18 +23841,18 @@
             </w:r>
           </w:p>
         </w:tc>
-      </w:tr>
-      <w:tr>
-        <w:tc>
-          <w:tcPr>
-            <w:tcW w:type="dxa" w:w="4500"/>
-          </w:tcPr>
-          <w:p>
-            <w:r>
-              <w:t xml:space="preserve">NUEVO</w:t>
-            </w:r>
-          </w:p>
-        </w:tc>
+        <w:tc>
+          <w:tcPr>
+            <w:tcW w:type="dxa" w:w="4500"/>
+          </w:tcPr>
+          <w:p>
+            <w:r>
+              <w:t>258</w:t>
+            </w:r>
+          </w:p>
+        </w:tc>
+      </w:tr>
+      <w:tr>
         <w:tc>
           <w:tcPr>
             <w:tcW w:type="dxa" w:w="4500"/>
@@ -23056,18 +23863,18 @@
             </w:r>
           </w:p>
         </w:tc>
-      </w:tr>
-      <w:tr>
-        <w:tc>
-          <w:tcPr>
-            <w:tcW w:type="dxa" w:w="4500"/>
-          </w:tcPr>
-          <w:p>
-            <w:r>
-              <w:t xml:space="preserve">218</w:t>
-            </w:r>
-          </w:p>
-        </w:tc>
+        <w:tc>
+          <w:tcPr>
+            <w:tcW w:type="dxa" w:w="4500"/>
+          </w:tcPr>
+          <w:p>
+            <w:r>
+              <w:t>259</w:t>
+            </w:r>
+          </w:p>
+        </w:tc>
+      </w:tr>
+      <w:tr>
         <w:tc>
           <w:tcPr>
             <w:tcW w:type="dxa" w:w="4500"/>
@@ -23078,18 +23885,18 @@
             </w:r>
           </w:p>
         </w:tc>
-      </w:tr>
-      <w:tr>
-        <w:tc>
-          <w:tcPr>
-            <w:tcW w:type="dxa" w:w="4500"/>
-          </w:tcPr>
-          <w:p>
-            <w:r>
-              <w:t xml:space="preserve">219</w:t>
-            </w:r>
-          </w:p>
-        </w:tc>
+        <w:tc>
+          <w:tcPr>
+            <w:tcW w:type="dxa" w:w="4500"/>
+          </w:tcPr>
+          <w:p>
+            <w:r>
+              <w:t>260</w:t>
+            </w:r>
+          </w:p>
+        </w:tc>
+      </w:tr>
+      <w:tr>
         <w:tc>
           <w:tcPr>
             <w:tcW w:type="dxa" w:w="4500"/>
@@ -23100,18 +23907,18 @@
             </w:r>
           </w:p>
         </w:tc>
-      </w:tr>
-      <w:tr>
-        <w:tc>
-          <w:tcPr>
-            <w:tcW w:type="dxa" w:w="4500"/>
-          </w:tcPr>
-          <w:p>
-            <w:r>
-              <w:t xml:space="preserve">219 BIS</w:t>
-            </w:r>
-          </w:p>
-        </w:tc>
+        <w:tc>
+          <w:tcPr>
+            <w:tcW w:type="dxa" w:w="4500"/>
+          </w:tcPr>
+          <w:p>
+            <w:r>
+              <w:t>261</w:t>
+            </w:r>
+          </w:p>
+        </w:tc>
+      </w:tr>
+      <w:tr>
         <w:tc>
           <w:tcPr>
             <w:tcW w:type="dxa" w:w="4500"/>
@@ -23122,18 +23929,18 @@
             </w:r>
           </w:p>
         </w:tc>
-      </w:tr>
-      <w:tr>
-        <w:tc>
-          <w:tcPr>
-            <w:tcW w:type="dxa" w:w="4500"/>
-          </w:tcPr>
-          <w:p>
-            <w:r>
-              <w:t xml:space="preserve">220</w:t>
-            </w:r>
-          </w:p>
-        </w:tc>
+        <w:tc>
+          <w:tcPr>
+            <w:tcW w:type="dxa" w:w="4500"/>
+          </w:tcPr>
+          <w:p>
+            <w:r>
+              <w:t>262</w:t>
+            </w:r>
+          </w:p>
+        </w:tc>
+      </w:tr>
+      <w:tr>
         <w:tc>
           <w:tcPr>
             <w:tcW w:type="dxa" w:w="4500"/>
@@ -23144,18 +23951,18 @@
             </w:r>
           </w:p>
         </w:tc>
-      </w:tr>
-      <w:tr>
-        <w:tc>
-          <w:tcPr>
-            <w:tcW w:type="dxa" w:w="4500"/>
-          </w:tcPr>
-          <w:p>
-            <w:r>
-              <w:t xml:space="preserve">220 BIS</w:t>
-            </w:r>
-          </w:p>
-        </w:tc>
+        <w:tc>
+          <w:tcPr>
+            <w:tcW w:type="dxa" w:w="4500"/>
+          </w:tcPr>
+          <w:p>
+            <w:r>
+              <w:t>263</w:t>
+            </w:r>
+          </w:p>
+        </w:tc>
+      </w:tr>
+      <w:tr>
         <w:tc>
           <w:tcPr>
             <w:tcW w:type="dxa" w:w="4500"/>
@@ -23166,18 +23973,18 @@
             </w:r>
           </w:p>
         </w:tc>
-      </w:tr>
-      <w:tr>
-        <w:tc>
-          <w:tcPr>
-            <w:tcW w:type="dxa" w:w="4500"/>
-          </w:tcPr>
-          <w:p>
-            <w:r>
-              <w:t xml:space="preserve">220 TER</w:t>
-            </w:r>
-          </w:p>
-        </w:tc>
+        <w:tc>
+          <w:tcPr>
+            <w:tcW w:type="dxa" w:w="4500"/>
+          </w:tcPr>
+          <w:p>
+            <w:r>
+              <w:t>264</w:t>
+            </w:r>
+          </w:p>
+        </w:tc>
+      </w:tr>
+      <w:tr>
         <w:tc>
           <w:tcPr>
             <w:tcW w:type="dxa" w:w="4500"/>
@@ -23188,18 +23995,18 @@
             </w:r>
           </w:p>
         </w:tc>
-      </w:tr>
-      <w:tr>
-        <w:tc>
-          <w:tcPr>
-            <w:tcW w:type="dxa" w:w="4500"/>
-          </w:tcPr>
-          <w:p>
-            <w:r>
-              <w:t xml:space="preserve">220 QUATER</w:t>
-            </w:r>
-          </w:p>
-        </w:tc>
+        <w:tc>
+          <w:tcPr>
+            <w:tcW w:type="dxa" w:w="4500"/>
+          </w:tcPr>
+          <w:p>
+            <w:r>
+              <w:t>265</w:t>
+            </w:r>
+          </w:p>
+        </w:tc>
+      </w:tr>
+      <w:tr>
         <w:tc>
           <w:tcPr>
             <w:tcW w:type="dxa" w:w="4500"/>
@@ -23210,18 +24017,18 @@
             </w:r>
           </w:p>
         </w:tc>
-      </w:tr>
-      <w:tr>
-        <w:tc>
-          <w:tcPr>
-            <w:tcW w:type="dxa" w:w="4500"/>
-          </w:tcPr>
-          <w:p>
-            <w:r>
-              <w:t xml:space="preserve">220 QUINQUIES</w:t>
-            </w:r>
-          </w:p>
-        </w:tc>
+        <w:tc>
+          <w:tcPr>
+            <w:tcW w:type="dxa" w:w="4500"/>
+          </w:tcPr>
+          <w:p>
+            <w:r>
+              <w:t>266</w:t>
+            </w:r>
+          </w:p>
+        </w:tc>
+      </w:tr>
+      <w:tr>
         <w:tc>
           <w:tcPr>
             <w:tcW w:type="dxa" w:w="4500"/>
@@ -23232,18 +24039,18 @@
             </w:r>
           </w:p>
         </w:tc>
-      </w:tr>
-      <w:tr>
-        <w:tc>
-          <w:tcPr>
-            <w:tcW w:type="dxa" w:w="4500"/>
-          </w:tcPr>
-          <w:p>
-            <w:r>
-              <w:t xml:space="preserve">220 SEXIES</w:t>
-            </w:r>
-          </w:p>
-        </w:tc>
+        <w:tc>
+          <w:tcPr>
+            <w:tcW w:type="dxa" w:w="4500"/>
+          </w:tcPr>
+          <w:p>
+            <w:r>
+              <w:t>267</w:t>
+            </w:r>
+          </w:p>
+        </w:tc>
+      </w:tr>
+      <w:tr>
         <w:tc>
           <w:tcPr>
             <w:tcW w:type="dxa" w:w="4500"/>
@@ -23254,18 +24061,18 @@
             </w:r>
           </w:p>
         </w:tc>
-      </w:tr>
-      <w:tr>
-        <w:tc>
-          <w:tcPr>
-            <w:tcW w:type="dxa" w:w="4500"/>
-          </w:tcPr>
-          <w:p>
-            <w:r>
-              <w:t xml:space="preserve">220 SEPTIES</w:t>
-            </w:r>
-          </w:p>
-        </w:tc>
+        <w:tc>
+          <w:tcPr>
+            <w:tcW w:type="dxa" w:w="4500"/>
+          </w:tcPr>
+          <w:p>
+            <w:r>
+              <w:t>268</w:t>
+            </w:r>
+          </w:p>
+        </w:tc>
+      </w:tr>
+      <w:tr>
         <w:tc>
           <w:tcPr>
             <w:tcW w:type="dxa" w:w="4500"/>
@@ -23276,18 +24083,18 @@
             </w:r>
           </w:p>
         </w:tc>
-      </w:tr>
-      <w:tr>
-        <w:tc>
-          <w:tcPr>
-            <w:tcW w:type="dxa" w:w="4500"/>
-          </w:tcPr>
-          <w:p>
-            <w:r>
-              <w:t xml:space="preserve">220 OCTIES</w:t>
-            </w:r>
-          </w:p>
-        </w:tc>
+        <w:tc>
+          <w:tcPr>
+            <w:tcW w:type="dxa" w:w="4500"/>
+          </w:tcPr>
+          <w:p>
+            <w:r>
+              <w:t>269</w:t>
+            </w:r>
+          </w:p>
+        </w:tc>
+      </w:tr>
+      <w:tr>
         <w:tc>
           <w:tcPr>
             <w:tcW w:type="dxa" w:w="4500"/>
@@ -23298,18 +24105,18 @@
             </w:r>
           </w:p>
         </w:tc>
-      </w:tr>
-      <w:tr>
-        <w:tc>
-          <w:tcPr>
-            <w:tcW w:type="dxa" w:w="4500"/>
-          </w:tcPr>
-          <w:p>
-            <w:r>
-              <w:t xml:space="preserve">220 NOVIES</w:t>
-            </w:r>
-          </w:p>
-        </w:tc>
+        <w:tc>
+          <w:tcPr>
+            <w:tcW w:type="dxa" w:w="4500"/>
+          </w:tcPr>
+          <w:p>
+            <w:r>
+              <w:t>270</w:t>
+            </w:r>
+          </w:p>
+        </w:tc>
+      </w:tr>
+      <w:tr>
         <w:tc>
           <w:tcPr>
             <w:tcW w:type="dxa" w:w="4500"/>
@@ -23320,18 +24127,18 @@
             </w:r>
           </w:p>
         </w:tc>
-      </w:tr>
-      <w:tr>
-        <w:tc>
-          <w:tcPr>
-            <w:tcW w:type="dxa" w:w="4500"/>
-          </w:tcPr>
-          <w:p>
-            <w:r>
-              <w:t xml:space="preserve">220 DECIES</w:t>
-            </w:r>
-          </w:p>
-        </w:tc>
+        <w:tc>
+          <w:tcPr>
+            <w:tcW w:type="dxa" w:w="4500"/>
+          </w:tcPr>
+          <w:p>
+            <w:r>
+              <w:t>271</w:t>
+            </w:r>
+          </w:p>
+        </w:tc>
+      </w:tr>
+      <w:tr>
         <w:tc>
           <w:tcPr>
             <w:tcW w:type="dxa" w:w="4500"/>
@@ -23342,18 +24149,18 @@
             </w:r>
           </w:p>
         </w:tc>
-      </w:tr>
-      <w:tr>
-        <w:tc>
-          <w:tcPr>
-            <w:tcW w:type="dxa" w:w="4500"/>
-          </w:tcPr>
-          <w:p>
-            <w:r>
-              <w:t xml:space="preserve">220 UNDECIES</w:t>
-            </w:r>
-          </w:p>
-        </w:tc>
+        <w:tc>
+          <w:tcPr>
+            <w:tcW w:type="dxa" w:w="4500"/>
+          </w:tcPr>
+          <w:p>
+            <w:r>
+              <w:t>272</w:t>
+            </w:r>
+          </w:p>
+        </w:tc>
+      </w:tr>
+      <w:tr>
         <w:tc>
           <w:tcPr>
             <w:tcW w:type="dxa" w:w="4500"/>
@@ -23364,18 +24171,18 @@
             </w:r>
           </w:p>
         </w:tc>
-      </w:tr>
-      <w:tr>
-        <w:tc>
-          <w:tcPr>
-            <w:tcW w:type="dxa" w:w="4500"/>
-          </w:tcPr>
-          <w:p>
-            <w:r>
-              <w:t xml:space="preserve">220 DUODECIES</w:t>
-            </w:r>
-          </w:p>
-        </w:tc>
+        <w:tc>
+          <w:tcPr>
+            <w:tcW w:type="dxa" w:w="4500"/>
+          </w:tcPr>
+          <w:p>
+            <w:r>
+              <w:t>273</w:t>
+            </w:r>
+          </w:p>
+        </w:tc>
+      </w:tr>
+      <w:tr>
         <w:tc>
           <w:tcPr>
             <w:tcW w:type="dxa" w:w="4500"/>
@@ -23386,18 +24193,18 @@
             </w:r>
           </w:p>
         </w:tc>
-      </w:tr>
-      <w:tr>
-        <w:tc>
-          <w:tcPr>
-            <w:tcW w:type="dxa" w:w="4500"/>
-          </w:tcPr>
-          <w:p>
-            <w:r>
-              <w:t xml:space="preserve">220 TERDECIES</w:t>
-            </w:r>
-          </w:p>
-        </w:tc>
+        <w:tc>
+          <w:tcPr>
+            <w:tcW w:type="dxa" w:w="4500"/>
+          </w:tcPr>
+          <w:p>
+            <w:r>
+              <w:t>274</w:t>
+            </w:r>
+          </w:p>
+        </w:tc>
+      </w:tr>
+      <w:tr>
         <w:tc>
           <w:tcPr>
             <w:tcW w:type="dxa" w:w="4500"/>
@@ -23408,18 +24215,18 @@
             </w:r>
           </w:p>
         </w:tc>
-      </w:tr>
-      <w:tr>
-        <w:tc>
-          <w:tcPr>
-            <w:tcW w:type="dxa" w:w="4500"/>
-          </w:tcPr>
-          <w:p>
-            <w:r>
-              <w:t xml:space="preserve">220 QUATERDECIES</w:t>
-            </w:r>
-          </w:p>
-        </w:tc>
+        <w:tc>
+          <w:tcPr>
+            <w:tcW w:type="dxa" w:w="4500"/>
+          </w:tcPr>
+          <w:p>
+            <w:r>
+              <w:t>275</w:t>
+            </w:r>
+          </w:p>
+        </w:tc>
+      </w:tr>
+      <w:tr>
         <w:tc>
           <w:tcPr>
             <w:tcW w:type="dxa" w:w="4500"/>
@@ -23430,18 +24237,18 @@
             </w:r>
           </w:p>
         </w:tc>
-      </w:tr>
-      <w:tr>
-        <w:tc>
-          <w:tcPr>
-            <w:tcW w:type="dxa" w:w="4500"/>
-          </w:tcPr>
-          <w:p>
-            <w:r>
-              <w:t xml:space="preserve">220 QUINDECIES</w:t>
-            </w:r>
-          </w:p>
-        </w:tc>
+        <w:tc>
+          <w:tcPr>
+            <w:tcW w:type="dxa" w:w="4500"/>
+          </w:tcPr>
+          <w:p>
+            <w:r>
+              <w:t>276</w:t>
+            </w:r>
+          </w:p>
+        </w:tc>
+      </w:tr>
+      <w:tr>
         <w:tc>
           <w:tcPr>
             <w:tcW w:type="dxa" w:w="4500"/>
@@ -23452,18 +24259,18 @@
             </w:r>
           </w:p>
         </w:tc>
-      </w:tr>
-      <w:tr>
-        <w:tc>
-          <w:tcPr>
-            <w:tcW w:type="dxa" w:w="4500"/>
-          </w:tcPr>
-          <w:p>
-            <w:r>
-              <w:t xml:space="preserve">221</w:t>
-            </w:r>
-          </w:p>
-        </w:tc>
+        <w:tc>
+          <w:tcPr>
+            <w:tcW w:type="dxa" w:w="4500"/>
+          </w:tcPr>
+          <w:p>
+            <w:r>
+              <w:t>277</w:t>
+            </w:r>
+          </w:p>
+        </w:tc>
+      </w:tr>
+      <w:tr>
         <w:tc>
           <w:tcPr>
             <w:tcW w:type="dxa" w:w="4500"/>
@@ -23474,18 +24281,18 @@
             </w:r>
           </w:p>
         </w:tc>
-      </w:tr>
-      <w:tr>
-        <w:tc>
-          <w:tcPr>
-            <w:tcW w:type="dxa" w:w="4500"/>
-          </w:tcPr>
-          <w:p>
-            <w:r>
-              <w:t xml:space="preserve">221 BIS</w:t>
-            </w:r>
-          </w:p>
-        </w:tc>
+        <w:tc>
+          <w:tcPr>
+            <w:tcW w:type="dxa" w:w="4500"/>
+          </w:tcPr>
+          <w:p>
+            <w:r>
+              <w:t>278</w:t>
+            </w:r>
+          </w:p>
+        </w:tc>
+      </w:tr>
+      <w:tr>
         <w:tc>
           <w:tcPr>
             <w:tcW w:type="dxa" w:w="4500"/>
@@ -23496,18 +24303,18 @@
             </w:r>
           </w:p>
         </w:tc>
-      </w:tr>
-      <w:tr>
-        <w:tc>
-          <w:tcPr>
-            <w:tcW w:type="dxa" w:w="4500"/>
-          </w:tcPr>
-          <w:p>
-            <w:r>
-              <w:t xml:space="preserve">222</w:t>
-            </w:r>
-          </w:p>
-        </w:tc>
+        <w:tc>
+          <w:tcPr>
+            <w:tcW w:type="dxa" w:w="4500"/>
+          </w:tcPr>
+          <w:p>
+            <w:r>
+              <w:t>279</w:t>
+            </w:r>
+          </w:p>
+        </w:tc>
+      </w:tr>
+      <w:tr>
         <w:tc>
           <w:tcPr>
             <w:tcW w:type="dxa" w:w="4500"/>
@@ -23518,18 +24325,18 @@
             </w:r>
           </w:p>
         </w:tc>
-      </w:tr>
-      <w:tr>
-        <w:tc>
-          <w:tcPr>
-            <w:tcW w:type="dxa" w:w="4500"/>
-          </w:tcPr>
-          <w:p>
-            <w:r>
-              <w:t xml:space="preserve">222 TER</w:t>
-            </w:r>
-          </w:p>
-        </w:tc>
+        <w:tc>
+          <w:tcPr>
+            <w:tcW w:type="dxa" w:w="4500"/>
+          </w:tcPr>
+          <w:p>
+            <w:r>
+              <w:t>280</w:t>
+            </w:r>
+          </w:p>
+        </w:tc>
+      </w:tr>
+      <w:tr>
         <w:tc>
           <w:tcPr>
             <w:tcW w:type="dxa" w:w="4500"/>
@@ -23540,18 +24347,18 @@
             </w:r>
           </w:p>
         </w:tc>
-      </w:tr>
-      <w:tr>
-        <w:tc>
-          <w:tcPr>
-            <w:tcW w:type="dxa" w:w="4500"/>
-          </w:tcPr>
-          <w:p>
-            <w:r>
-              <w:t xml:space="preserve">222 QUATER</w:t>
-            </w:r>
-          </w:p>
-        </w:tc>
+        <w:tc>
+          <w:tcPr>
+            <w:tcW w:type="dxa" w:w="4500"/>
+          </w:tcPr>
+          <w:p>
+            <w:r>
+              <w:t>281</w:t>
+            </w:r>
+          </w:p>
+        </w:tc>
+      </w:tr>
+      <w:tr>
         <w:tc>
           <w:tcPr>
             <w:tcW w:type="dxa" w:w="4500"/>
@@ -23562,18 +24369,18 @@
             </w:r>
           </w:p>
         </w:tc>
-      </w:tr>
-      <w:tr>
-        <w:tc>
-          <w:tcPr>
-            <w:tcW w:type="dxa" w:w="4500"/>
-          </w:tcPr>
-          <w:p>
-            <w:r>
-              <w:t xml:space="preserve">222 QUINQUIES</w:t>
-            </w:r>
-          </w:p>
-        </w:tc>
+        <w:tc>
+          <w:tcPr>
+            <w:tcW w:type="dxa" w:w="4500"/>
+          </w:tcPr>
+          <w:p>
+            <w:r>
+              <w:t>282</w:t>
+            </w:r>
+          </w:p>
+        </w:tc>
+      </w:tr>
+      <w:tr>
         <w:tc>
           <w:tcPr>
             <w:tcW w:type="dxa" w:w="4500"/>
@@ -23584,18 +24391,18 @@
             </w:r>
           </w:p>
         </w:tc>
-      </w:tr>
-      <w:tr>
-        <w:tc>
-          <w:tcPr>
-            <w:tcW w:type="dxa" w:w="4500"/>
-          </w:tcPr>
-          <w:p>
-            <w:r>
-              <w:t xml:space="preserve">223</w:t>
-            </w:r>
-          </w:p>
-        </w:tc>
+        <w:tc>
+          <w:tcPr>
+            <w:tcW w:type="dxa" w:w="4500"/>
+          </w:tcPr>
+          <w:p>
+            <w:r>
+              <w:t>283</w:t>
+            </w:r>
+          </w:p>
+        </w:tc>
+      </w:tr>
+      <w:tr>
         <w:tc>
           <w:tcPr>
             <w:tcW w:type="dxa" w:w="4500"/>
@@ -23606,18 +24413,18 @@
             </w:r>
           </w:p>
         </w:tc>
-      </w:tr>
-      <w:tr>
-        <w:tc>
-          <w:tcPr>
-            <w:tcW w:type="dxa" w:w="4500"/>
-          </w:tcPr>
-          <w:p>
-            <w:r>
-              <w:t xml:space="preserve">224</w:t>
-            </w:r>
-          </w:p>
-        </w:tc>
+        <w:tc>
+          <w:tcPr>
+            <w:tcW w:type="dxa" w:w="4500"/>
+          </w:tcPr>
+          <w:p>
+            <w:r>
+              <w:t>284</w:t>
+            </w:r>
+          </w:p>
+        </w:tc>
+      </w:tr>
+      <w:tr>
         <w:tc>
           <w:tcPr>
             <w:tcW w:type="dxa" w:w="4500"/>
@@ -23628,18 +24435,18 @@
             </w:r>
           </w:p>
         </w:tc>
-      </w:tr>
-      <w:tr>
-        <w:tc>
-          <w:tcPr>
-            <w:tcW w:type="dxa" w:w="4500"/>
-          </w:tcPr>
-          <w:p>
-            <w:r>
-              <w:t xml:space="preserve">225</w:t>
-            </w:r>
-          </w:p>
-        </w:tc>
+        <w:tc>
+          <w:tcPr>
+            <w:tcW w:type="dxa" w:w="4500"/>
+          </w:tcPr>
+          <w:p>
+            <w:r>
+              <w:t>285</w:t>
+            </w:r>
+          </w:p>
+        </w:tc>
+      </w:tr>
+      <w:tr>
         <w:tc>
           <w:tcPr>
             <w:tcW w:type="dxa" w:w="4500"/>
@@ -23650,18 +24457,18 @@
             </w:r>
           </w:p>
         </w:tc>
-      </w:tr>
-      <w:tr>
-        <w:tc>
-          <w:tcPr>
-            <w:tcW w:type="dxa" w:w="4500"/>
-          </w:tcPr>
-          <w:p>
-            <w:r>
-              <w:t xml:space="preserve">226</w:t>
-            </w:r>
-          </w:p>
-        </w:tc>
+        <w:tc>
+          <w:tcPr>
+            <w:tcW w:type="dxa" w:w="4500"/>
+          </w:tcPr>
+          <w:p>
+            <w:r>
+              <w:t>286</w:t>
+            </w:r>
+          </w:p>
+        </w:tc>
+      </w:tr>
+      <w:tr>
         <w:tc>
           <w:tcPr>
             <w:tcW w:type="dxa" w:w="4500"/>
@@ -23672,18 +24479,18 @@
             </w:r>
           </w:p>
         </w:tc>
-      </w:tr>
-      <w:tr>
-        <w:tc>
-          <w:tcPr>
-            <w:tcW w:type="dxa" w:w="4500"/>
-          </w:tcPr>
-          <w:p>
-            <w:r>
-              <w:t xml:space="preserve">227</w:t>
-            </w:r>
-          </w:p>
-        </w:tc>
+        <w:tc>
+          <w:tcPr>
+            <w:tcW w:type="dxa" w:w="4500"/>
+          </w:tcPr>
+          <w:p>
+            <w:r>
+              <w:t>287</w:t>
+            </w:r>
+          </w:p>
+        </w:tc>
+      </w:tr>
+      <w:tr>
         <w:tc>
           <w:tcPr>
             <w:tcW w:type="dxa" w:w="4500"/>
@@ -23694,18 +24501,18 @@
             </w:r>
           </w:p>
         </w:tc>
-      </w:tr>
-      <w:tr>
-        <w:tc>
-          <w:tcPr>
-            <w:tcW w:type="dxa" w:w="4500"/>
-          </w:tcPr>
-          <w:p>
-            <w:r>
-              <w:t xml:space="preserve">228</w:t>
-            </w:r>
-          </w:p>
-        </w:tc>
+        <w:tc>
+          <w:tcPr>
+            <w:tcW w:type="dxa" w:w="4500"/>
+          </w:tcPr>
+          <w:p>
+            <w:r>
+              <w:t>288</w:t>
+            </w:r>
+          </w:p>
+        </w:tc>
+      </w:tr>
+      <w:tr>
         <w:tc>
           <w:tcPr>
             <w:tcW w:type="dxa" w:w="4500"/>
@@ -23716,18 +24523,18 @@
             </w:r>
           </w:p>
         </w:tc>
-      </w:tr>
-      <w:tr>
-        <w:tc>
-          <w:tcPr>
-            <w:tcW w:type="dxa" w:w="4500"/>
-          </w:tcPr>
-          <w:p>
-            <w:r>
-              <w:t xml:space="preserve">229</w:t>
-            </w:r>
-          </w:p>
-        </w:tc>
+        <w:tc>
+          <w:tcPr>
+            <w:tcW w:type="dxa" w:w="4500"/>
+          </w:tcPr>
+          <w:p>
+            <w:r>
+              <w:t>289</w:t>
+            </w:r>
+          </w:p>
+        </w:tc>
+      </w:tr>
+      <w:tr>
         <w:tc>
           <w:tcPr>
             <w:tcW w:type="dxa" w:w="4500"/>
@@ -23738,18 +24545,18 @@
             </w:r>
           </w:p>
         </w:tc>
-      </w:tr>
-      <w:tr>
-        <w:tc>
-          <w:tcPr>
-            <w:tcW w:type="dxa" w:w="4500"/>
-          </w:tcPr>
-          <w:p>
-            <w:r>
-              <w:t xml:space="preserve">230</w:t>
-            </w:r>
-          </w:p>
-        </w:tc>
+        <w:tc>
+          <w:tcPr>
+            <w:tcW w:type="dxa" w:w="4500"/>
+          </w:tcPr>
+          <w:p>
+            <w:r>
+              <w:t>290</w:t>
+            </w:r>
+          </w:p>
+        </w:tc>
+      </w:tr>
+      <w:tr>
         <w:tc>
           <w:tcPr>
             <w:tcW w:type="dxa" w:w="4500"/>
@@ -23760,18 +24567,18 @@
             </w:r>
           </w:p>
         </w:tc>
-      </w:tr>
-      <w:tr>
-        <w:tc>
-          <w:tcPr>
-            <w:tcW w:type="dxa" w:w="4500"/>
-          </w:tcPr>
-          <w:p>
-            <w:r>
-              <w:t xml:space="preserve">231</w:t>
-            </w:r>
-          </w:p>
-        </w:tc>
+        <w:tc>
+          <w:tcPr>
+            <w:tcW w:type="dxa" w:w="4500"/>
+          </w:tcPr>
+          <w:p>
+            <w:r>
+              <w:t>291</w:t>
+            </w:r>
+          </w:p>
+        </w:tc>
+      </w:tr>
+      <w:tr>
         <w:tc>
           <w:tcPr>
             <w:tcW w:type="dxa" w:w="4500"/>
@@ -23782,18 +24589,18 @@
             </w:r>
           </w:p>
         </w:tc>
-      </w:tr>
-      <w:tr>
-        <w:tc>
-          <w:tcPr>
-            <w:tcW w:type="dxa" w:w="4500"/>
-          </w:tcPr>
-          <w:p>
-            <w:r>
-              <w:t xml:space="preserve">232</w:t>
-            </w:r>
-          </w:p>
-        </w:tc>
+        <w:tc>
+          <w:tcPr>
+            <w:tcW w:type="dxa" w:w="4500"/>
+          </w:tcPr>
+          <w:p>
+            <w:r>
+              <w:t>292</w:t>
+            </w:r>
+          </w:p>
+        </w:tc>
+      </w:tr>
+      <w:tr>
         <w:tc>
           <w:tcPr>
             <w:tcW w:type="dxa" w:w="4500"/>
@@ -23804,18 +24611,18 @@
             </w:r>
           </w:p>
         </w:tc>
-      </w:tr>
-      <w:tr>
-        <w:tc>
-          <w:tcPr>
-            <w:tcW w:type="dxa" w:w="4500"/>
-          </w:tcPr>
-          <w:p>
-            <w:r>
-              <w:t xml:space="preserve">233</w:t>
-            </w:r>
-          </w:p>
-        </w:tc>
+        <w:tc>
+          <w:tcPr>
+            <w:tcW w:type="dxa" w:w="4500"/>
+          </w:tcPr>
+          <w:p>
+            <w:r>
+              <w:t>293</w:t>
+            </w:r>
+          </w:p>
+        </w:tc>
+      </w:tr>
+      <w:tr>
         <w:tc>
           <w:tcPr>
             <w:tcW w:type="dxa" w:w="4500"/>
@@ -23826,18 +24633,18 @@
             </w:r>
           </w:p>
         </w:tc>
-      </w:tr>
-      <w:tr>
-        <w:tc>
-          <w:tcPr>
-            <w:tcW w:type="dxa" w:w="4500"/>
-          </w:tcPr>
-          <w:p>
-            <w:r>
-              <w:t xml:space="preserve">234</w:t>
-            </w:r>
-          </w:p>
-        </w:tc>
+        <w:tc>
+          <w:tcPr>
+            <w:tcW w:type="dxa" w:w="4500"/>
+          </w:tcPr>
+          <w:p>
+            <w:r>
+              <w:t>294</w:t>
+            </w:r>
+          </w:p>
+        </w:tc>
+      </w:tr>
+      <w:tr>
         <w:tc>
           <w:tcPr>
             <w:tcW w:type="dxa" w:w="4500"/>
@@ -23848,18 +24655,18 @@
             </w:r>
           </w:p>
         </w:tc>
-      </w:tr>
-      <w:tr>
-        <w:tc>
-          <w:tcPr>
-            <w:tcW w:type="dxa" w:w="4500"/>
-          </w:tcPr>
-          <w:p>
-            <w:r>
-              <w:t xml:space="preserve">235</w:t>
-            </w:r>
-          </w:p>
-        </w:tc>
+        <w:tc>
+          <w:tcPr>
+            <w:tcW w:type="dxa" w:w="4500"/>
+          </w:tcPr>
+          <w:p>
+            <w:r>
+              <w:t>295</w:t>
+            </w:r>
+          </w:p>
+        </w:tc>
+      </w:tr>
+      <w:tr>
         <w:tc>
           <w:tcPr>
             <w:tcW w:type="dxa" w:w="4500"/>
@@ -23870,18 +24677,18 @@
             </w:r>
           </w:p>
         </w:tc>
-      </w:tr>
-      <w:tr>
-        <w:tc>
-          <w:tcPr>
-            <w:tcW w:type="dxa" w:w="4500"/>
-          </w:tcPr>
-          <w:p>
-            <w:r>
-              <w:t xml:space="preserve">236</w:t>
-            </w:r>
-          </w:p>
-        </w:tc>
+        <w:tc>
+          <w:tcPr>
+            <w:tcW w:type="dxa" w:w="4500"/>
+          </w:tcPr>
+          <w:p>
+            <w:r>
+              <w:t>296</w:t>
+            </w:r>
+          </w:p>
+        </w:tc>
+      </w:tr>
+      <w:tr>
         <w:tc>
           <w:tcPr>
             <w:tcW w:type="dxa" w:w="4500"/>
@@ -23892,18 +24699,18 @@
             </w:r>
           </w:p>
         </w:tc>
-      </w:tr>
-      <w:tr>
-        <w:tc>
-          <w:tcPr>
-            <w:tcW w:type="dxa" w:w="4500"/>
-          </w:tcPr>
-          <w:p>
-            <w:r>
-              <w:t xml:space="preserve">237</w:t>
-            </w:r>
-          </w:p>
-        </w:tc>
+        <w:tc>
+          <w:tcPr>
+            <w:tcW w:type="dxa" w:w="4500"/>
+          </w:tcPr>
+          <w:p>
+            <w:r>
+              <w:t>297</w:t>
+            </w:r>
+          </w:p>
+        </w:tc>
+      </w:tr>
+      <w:tr>
         <w:tc>
           <w:tcPr>
             <w:tcW w:type="dxa" w:w="4500"/>
@@ -23914,18 +24721,18 @@
             </w:r>
           </w:p>
         </w:tc>
-      </w:tr>
-      <w:tr>
-        <w:tc>
-          <w:tcPr>
-            <w:tcW w:type="dxa" w:w="4500"/>
-          </w:tcPr>
-          <w:p>
-            <w:r>
-              <w:t xml:space="preserve">238</w:t>
-            </w:r>
-          </w:p>
-        </w:tc>
+        <w:tc>
+          <w:tcPr>
+            <w:tcW w:type="dxa" w:w="4500"/>
+          </w:tcPr>
+          <w:p>
+            <w:r>
+              <w:t>298</w:t>
+            </w:r>
+          </w:p>
+        </w:tc>
+      </w:tr>
+      <w:tr>
         <w:tc>
           <w:tcPr>
             <w:tcW w:type="dxa" w:w="4500"/>
@@ -23936,18 +24743,18 @@
             </w:r>
           </w:p>
         </w:tc>
-      </w:tr>
-      <w:tr>
-        <w:tc>
-          <w:tcPr>
-            <w:tcW w:type="dxa" w:w="4500"/>
-          </w:tcPr>
-          <w:p>
-            <w:r>
-              <w:t xml:space="preserve">239</w:t>
-            </w:r>
-          </w:p>
-        </w:tc>
+        <w:tc>
+          <w:tcPr>
+            <w:tcW w:type="dxa" w:w="4500"/>
+          </w:tcPr>
+          <w:p>
+            <w:r>
+              <w:t>299</w:t>
+            </w:r>
+          </w:p>
+        </w:tc>
+      </w:tr>
+      <w:tr>
         <w:tc>
           <w:tcPr>
             <w:tcW w:type="dxa" w:w="4500"/>
@@ -23958,18 +24765,18 @@
             </w:r>
           </w:p>
         </w:tc>
-      </w:tr>
-      <w:tr>
-        <w:tc>
-          <w:tcPr>
-            <w:tcW w:type="dxa" w:w="4500"/>
-          </w:tcPr>
-          <w:p>
-            <w:r>
-              <w:t xml:space="preserve">240</w:t>
-            </w:r>
-          </w:p>
-        </w:tc>
+        <w:tc>
+          <w:tcPr>
+            <w:tcW w:type="dxa" w:w="4500"/>
+          </w:tcPr>
+          <w:p>
+            <w:r>
+              <w:t>300</w:t>
+            </w:r>
+          </w:p>
+        </w:tc>
+      </w:tr>
+      <w:tr>
         <w:tc>
           <w:tcPr>
             <w:tcW w:type="dxa" w:w="4500"/>
@@ -23980,18 +24787,18 @@
             </w:r>
           </w:p>
         </w:tc>
-      </w:tr>
-      <w:tr>
-        <w:tc>
-          <w:tcPr>
-            <w:tcW w:type="dxa" w:w="4500"/>
-          </w:tcPr>
-          <w:p>
-            <w:r>
-              <w:t xml:space="preserve">241</w:t>
-            </w:r>
-          </w:p>
-        </w:tc>
+        <w:tc>
+          <w:tcPr>
+            <w:tcW w:type="dxa" w:w="4500"/>
+          </w:tcPr>
+          <w:p>
+            <w:r>
+              <w:t>301</w:t>
+            </w:r>
+          </w:p>
+        </w:tc>
+      </w:tr>
+      <w:tr>
         <w:tc>
           <w:tcPr>
             <w:tcW w:type="dxa" w:w="4500"/>
@@ -24002,18 +24809,18 @@
             </w:r>
           </w:p>
         </w:tc>
-      </w:tr>
-      <w:tr>
-        <w:tc>
-          <w:tcPr>
-            <w:tcW w:type="dxa" w:w="4500"/>
-          </w:tcPr>
-          <w:p>
-            <w:r>
-              <w:t xml:space="preserve">242</w:t>
-            </w:r>
-          </w:p>
-        </w:tc>
+        <w:tc>
+          <w:tcPr>
+            <w:tcW w:type="dxa" w:w="4500"/>
+          </w:tcPr>
+          <w:p>
+            <w:r>
+              <w:t>302</w:t>
+            </w:r>
+          </w:p>
+        </w:tc>
+      </w:tr>
+      <w:tr>
         <w:tc>
           <w:tcPr>
             <w:tcW w:type="dxa" w:w="4500"/>
@@ -24024,18 +24831,18 @@
             </w:r>
           </w:p>
         </w:tc>
-      </w:tr>
-      <w:tr>
-        <w:tc>
-          <w:tcPr>
-            <w:tcW w:type="dxa" w:w="4500"/>
-          </w:tcPr>
-          <w:p>
-            <w:r>
-              <w:t xml:space="preserve">243</w:t>
-            </w:r>
-          </w:p>
-        </w:tc>
+        <w:tc>
+          <w:tcPr>
+            <w:tcW w:type="dxa" w:w="4500"/>
+          </w:tcPr>
+          <w:p>
+            <w:r>
+              <w:t>303</w:t>
+            </w:r>
+          </w:p>
+        </w:tc>
+      </w:tr>
+      <w:tr>
         <w:tc>
           <w:tcPr>
             <w:tcW w:type="dxa" w:w="4500"/>
@@ -24046,18 +24853,18 @@
             </w:r>
           </w:p>
         </w:tc>
-      </w:tr>
-      <w:tr>
-        <w:tc>
-          <w:tcPr>
-            <w:tcW w:type="dxa" w:w="4500"/>
-          </w:tcPr>
-          <w:p>
-            <w:r>
-              <w:t xml:space="preserve">244</w:t>
-            </w:r>
-          </w:p>
-        </w:tc>
+        <w:tc>
+          <w:tcPr>
+            <w:tcW w:type="dxa" w:w="4500"/>
+          </w:tcPr>
+          <w:p>
+            <w:r>
+              <w:t>304</w:t>
+            </w:r>
+          </w:p>
+        </w:tc>
+      </w:tr>
+      <w:tr>
         <w:tc>
           <w:tcPr>
             <w:tcW w:type="dxa" w:w="4500"/>
@@ -24068,18 +24875,18 @@
             </w:r>
           </w:p>
         </w:tc>
-      </w:tr>
-      <w:tr>
-        <w:tc>
-          <w:tcPr>
-            <w:tcW w:type="dxa" w:w="4500"/>
-          </w:tcPr>
-          <w:p>
-            <w:r>
-              <w:t xml:space="preserve">245</w:t>
-            </w:r>
-          </w:p>
-        </w:tc>
+        <w:tc>
+          <w:tcPr>
+            <w:tcW w:type="dxa" w:w="4500"/>
+          </w:tcPr>
+          <w:p>
+            <w:r>
+              <w:t>305</w:t>
+            </w:r>
+          </w:p>
+        </w:tc>
+      </w:tr>
+      <w:tr>
         <w:tc>
           <w:tcPr>
             <w:tcW w:type="dxa" w:w="4500"/>
@@ -24090,18 +24897,18 @@
             </w:r>
           </w:p>
         </w:tc>
-      </w:tr>
-      <w:tr>
-        <w:tc>
-          <w:tcPr>
-            <w:tcW w:type="dxa" w:w="4500"/>
-          </w:tcPr>
-          <w:p>
-            <w:r>
-              <w:t xml:space="preserve">246</w:t>
-            </w:r>
-          </w:p>
-        </w:tc>
+        <w:tc>
+          <w:tcPr>
+            <w:tcW w:type="dxa" w:w="4500"/>
+          </w:tcPr>
+          <w:p>
+            <w:r>
+              <w:t>306</w:t>
+            </w:r>
+          </w:p>
+        </w:tc>
+      </w:tr>
+      <w:tr>
         <w:tc>
           <w:tcPr>
             <w:tcW w:type="dxa" w:w="4500"/>
@@ -24112,18 +24919,18 @@
             </w:r>
           </w:p>
         </w:tc>
-      </w:tr>
-      <w:tr>
-        <w:tc>
-          <w:tcPr>
-            <w:tcW w:type="dxa" w:w="4500"/>
-          </w:tcPr>
-          <w:p>
-            <w:r>
-              <w:t xml:space="preserve">247</w:t>
-            </w:r>
-          </w:p>
-        </w:tc>
+        <w:tc>
+          <w:tcPr>
+            <w:tcW w:type="dxa" w:w="4500"/>
+          </w:tcPr>
+          <w:p>
+            <w:r>
+              <w:t>307</w:t>
+            </w:r>
+          </w:p>
+        </w:tc>
+      </w:tr>
+      <w:tr>
         <w:tc>
           <w:tcPr>
             <w:tcW w:type="dxa" w:w="4500"/>
@@ -24134,18 +24941,18 @@
             </w:r>
           </w:p>
         </w:tc>
-      </w:tr>
-      <w:tr>
-        <w:tc>
-          <w:tcPr>
-            <w:tcW w:type="dxa" w:w="4500"/>
-          </w:tcPr>
-          <w:p>
-            <w:r>
-              <w:t xml:space="preserve">248</w:t>
-            </w:r>
-          </w:p>
-        </w:tc>
+        <w:tc>
+          <w:tcPr>
+            <w:tcW w:type="dxa" w:w="4500"/>
+          </w:tcPr>
+          <w:p>
+            <w:r>
+              <w:t>308</w:t>
+            </w:r>
+          </w:p>
+        </w:tc>
+      </w:tr>
+      <w:tr>
         <w:tc>
           <w:tcPr>
             <w:tcW w:type="dxa" w:w="4500"/>
@@ -24156,18 +24963,18 @@
             </w:r>
           </w:p>
         </w:tc>
-      </w:tr>
-      <w:tr>
-        <w:tc>
-          <w:tcPr>
-            <w:tcW w:type="dxa" w:w="4500"/>
-          </w:tcPr>
-          <w:p>
-            <w:r>
-              <w:t xml:space="preserve">249</w:t>
-            </w:r>
-          </w:p>
-        </w:tc>
+        <w:tc>
+          <w:tcPr>
+            <w:tcW w:type="dxa" w:w="4500"/>
+          </w:tcPr>
+          <w:p>
+            <w:r>
+              <w:t>309</w:t>
+            </w:r>
+          </w:p>
+        </w:tc>
+      </w:tr>
+      <w:tr>
         <w:tc>
           <w:tcPr>
             <w:tcW w:type="dxa" w:w="4500"/>
@@ -24178,18 +24985,18 @@
             </w:r>
           </w:p>
         </w:tc>
-      </w:tr>
-      <w:tr>
-        <w:tc>
-          <w:tcPr>
-            <w:tcW w:type="dxa" w:w="4500"/>
-          </w:tcPr>
-          <w:p>
-            <w:r>
-              <w:t xml:space="preserve">250</w:t>
-            </w:r>
-          </w:p>
-        </w:tc>
+        <w:tc>
+          <w:tcPr>
+            <w:tcW w:type="dxa" w:w="4500"/>
+          </w:tcPr>
+          <w:p>
+            <w:r>
+              <w:t>310</w:t>
+            </w:r>
+          </w:p>
+        </w:tc>
+      </w:tr>
+      <w:tr>
         <w:tc>
           <w:tcPr>
             <w:tcW w:type="dxa" w:w="4500"/>
@@ -24200,18 +25007,18 @@
             </w:r>
           </w:p>
         </w:tc>
-      </w:tr>
-      <w:tr>
-        <w:tc>
-          <w:tcPr>
-            <w:tcW w:type="dxa" w:w="4500"/>
-          </w:tcPr>
-          <w:p>
-            <w:r>
-              <w:t xml:space="preserve">251</w:t>
-            </w:r>
-          </w:p>
-        </w:tc>
+        <w:tc>
+          <w:tcPr>
+            <w:tcW w:type="dxa" w:w="4500"/>
+          </w:tcPr>
+          <w:p>
+            <w:r>
+              <w:t>311</w:t>
+            </w:r>
+          </w:p>
+        </w:tc>
+      </w:tr>
+      <w:tr>
         <w:tc>
           <w:tcPr>
             <w:tcW w:type="dxa" w:w="4500"/>
@@ -24222,18 +25029,18 @@
             </w:r>
           </w:p>
         </w:tc>
-      </w:tr>
-      <w:tr>
-        <w:tc>
-          <w:tcPr>
-            <w:tcW w:type="dxa" w:w="4500"/>
-          </w:tcPr>
-          <w:p>
-            <w:r>
-              <w:t xml:space="preserve">252</w:t>
-            </w:r>
-          </w:p>
-        </w:tc>
+        <w:tc>
+          <w:tcPr>
+            <w:tcW w:type="dxa" w:w="4500"/>
+          </w:tcPr>
+          <w:p>
+            <w:r>
+              <w:t>312</w:t>
+            </w:r>
+          </w:p>
+        </w:tc>
+      </w:tr>
+      <w:tr>
         <w:tc>
           <w:tcPr>
             <w:tcW w:type="dxa" w:w="4500"/>
@@ -24244,18 +25051,18 @@
             </w:r>
           </w:p>
         </w:tc>
-      </w:tr>
-      <w:tr>
-        <w:tc>
-          <w:tcPr>
-            <w:tcW w:type="dxa" w:w="4500"/>
-          </w:tcPr>
-          <w:p>
-            <w:r>
-              <w:t xml:space="preserve">253</w:t>
-            </w:r>
-          </w:p>
-        </w:tc>
+        <w:tc>
+          <w:tcPr>
+            <w:tcW w:type="dxa" w:w="4500"/>
+          </w:tcPr>
+          <w:p>
+            <w:r>
+              <w:t>313</w:t>
+            </w:r>
+          </w:p>
+        </w:tc>
+      </w:tr>
+      <w:tr>
         <w:tc>
           <w:tcPr>
             <w:tcW w:type="dxa" w:w="4500"/>
@@ -24266,18 +25073,18 @@
             </w:r>
           </w:p>
         </w:tc>
-      </w:tr>
-      <w:tr>
-        <w:tc>
-          <w:tcPr>
-            <w:tcW w:type="dxa" w:w="4500"/>
-          </w:tcPr>
-          <w:p>
-            <w:r>
-              <w:t xml:space="preserve">254</w:t>
-            </w:r>
-          </w:p>
-        </w:tc>
+        <w:tc>
+          <w:tcPr>
+            <w:tcW w:type="dxa" w:w="4500"/>
+          </w:tcPr>
+          <w:p>
+            <w:r>
+              <w:t>314</w:t>
+            </w:r>
+          </w:p>
+        </w:tc>
+      </w:tr>
+      <w:tr>
         <w:tc>
           <w:tcPr>
             <w:tcW w:type="dxa" w:w="4500"/>
@@ -24288,18 +25095,18 @@
             </w:r>
           </w:p>
         </w:tc>
-      </w:tr>
-      <w:tr>
-        <w:tc>
-          <w:tcPr>
-            <w:tcW w:type="dxa" w:w="4500"/>
-          </w:tcPr>
-          <w:p>
-            <w:r>
-              <w:t xml:space="preserve">255</w:t>
-            </w:r>
-          </w:p>
-        </w:tc>
+        <w:tc>
+          <w:tcPr>
+            <w:tcW w:type="dxa" w:w="4500"/>
+          </w:tcPr>
+          <w:p>
+            <w:r>
+              <w:t>315</w:t>
+            </w:r>
+          </w:p>
+        </w:tc>
+      </w:tr>
+      <w:tr>
         <w:tc>
           <w:tcPr>
             <w:tcW w:type="dxa" w:w="4500"/>
@@ -24310,18 +25117,18 @@
             </w:r>
           </w:p>
         </w:tc>
-      </w:tr>
-      <w:tr>
-        <w:tc>
-          <w:tcPr>
-            <w:tcW w:type="dxa" w:w="4500"/>
-          </w:tcPr>
-          <w:p>
-            <w:r>
-              <w:t xml:space="preserve">256</w:t>
-            </w:r>
-          </w:p>
-        </w:tc>
+        <w:tc>
+          <w:tcPr>
+            <w:tcW w:type="dxa" w:w="4500"/>
+          </w:tcPr>
+          <w:p>
+            <w:r>
+              <w:t>316</w:t>
+            </w:r>
+          </w:p>
+        </w:tc>
+      </w:tr>
+      <w:tr>
         <w:tc>
           <w:tcPr>
             <w:tcW w:type="dxa" w:w="4500"/>
@@ -24332,18 +25139,18 @@
             </w:r>
           </w:p>
         </w:tc>
-      </w:tr>
-      <w:tr>
-        <w:tc>
-          <w:tcPr>
-            <w:tcW w:type="dxa" w:w="4500"/>
-          </w:tcPr>
-          <w:p>
-            <w:r>
-              <w:t xml:space="preserve">257</w:t>
-            </w:r>
-          </w:p>
-        </w:tc>
+        <w:tc>
+          <w:tcPr>
+            <w:tcW w:type="dxa" w:w="4500"/>
+          </w:tcPr>
+          <w:p>
+            <w:r>
+              <w:t>317</w:t>
+            </w:r>
+          </w:p>
+        </w:tc>
+      </w:tr>
+      <w:tr>
         <w:tc>
           <w:tcPr>
             <w:tcW w:type="dxa" w:w="4500"/>
@@ -24354,18 +25161,18 @@
             </w:r>
           </w:p>
         </w:tc>
-      </w:tr>
-      <w:tr>
-        <w:tc>
-          <w:tcPr>
-            <w:tcW w:type="dxa" w:w="4500"/>
-          </w:tcPr>
-          <w:p>
-            <w:r>
-              <w:t xml:space="preserve">258</w:t>
-            </w:r>
-          </w:p>
-        </w:tc>
+        <w:tc>
+          <w:tcPr>
+            <w:tcW w:type="dxa" w:w="4500"/>
+          </w:tcPr>
+          <w:p>
+            <w:r>
+              <w:t>318</w:t>
+            </w:r>
+          </w:p>
+        </w:tc>
+      </w:tr>
+      <w:tr>
         <w:tc>
           <w:tcPr>
             <w:tcW w:type="dxa" w:w="4500"/>
@@ -24376,619 +25183,13 @@
             </w:r>
           </w:p>
         </w:tc>
-      </w:tr>
-      <w:tr>
-        <w:tc>
-          <w:tcPr>
-            <w:tcW w:type="dxa" w:w="4500"/>
-          </w:tcPr>
-          <w:p>
-            <w:r>
-              <w:t xml:space="preserve">259</w:t>
-            </w:r>
-          </w:p>
-        </w:tc>
-        <w:tc>
-          <w:tcPr>
-            <w:tcW w:type="dxa" w:w="4500"/>
-          </w:tcPr>
-          <w:p>
-            <w:r>
-              <w:t xml:space="preserve">287</w:t>
-            </w:r>
-          </w:p>
-        </w:tc>
-      </w:tr>
-      <w:tr>
-        <w:tc>
-          <w:tcPr>
-            <w:tcW w:type="dxa" w:w="4500"/>
-          </w:tcPr>
-          <w:p>
-            <w:r>
-              <w:t xml:space="preserve">260</w:t>
-            </w:r>
-          </w:p>
-        </w:tc>
-        <w:tc>
-          <w:tcPr>
-            <w:tcW w:type="dxa" w:w="4500"/>
-          </w:tcPr>
-          <w:p>
-            <w:r>
-              <w:t xml:space="preserve">288</w:t>
-            </w:r>
-          </w:p>
-        </w:tc>
-      </w:tr>
-      <w:tr>
-        <w:tc>
-          <w:tcPr>
-            <w:tcW w:type="dxa" w:w="4500"/>
-          </w:tcPr>
-          <w:p>
-            <w:r>
-              <w:t xml:space="preserve">261</w:t>
-            </w:r>
-          </w:p>
-        </w:tc>
-        <w:tc>
-          <w:tcPr>
-            <w:tcW w:type="dxa" w:w="4500"/>
-          </w:tcPr>
-          <w:p>
-            <w:r>
-              <w:t xml:space="preserve">289</w:t>
-            </w:r>
-          </w:p>
-        </w:tc>
-      </w:tr>
-      <w:tr>
-        <w:tc>
-          <w:tcPr>
-            <w:tcW w:type="dxa" w:w="4500"/>
-          </w:tcPr>
-          <w:p>
-            <w:r>
-              <w:t xml:space="preserve">262</w:t>
-            </w:r>
-          </w:p>
-        </w:tc>
-        <w:tc>
-          <w:tcPr>
-            <w:tcW w:type="dxa" w:w="4500"/>
-          </w:tcPr>
-          <w:p>
-            <w:r>
-              <w:t xml:space="preserve">290</w:t>
-            </w:r>
-          </w:p>
-        </w:tc>
-      </w:tr>
-      <w:tr>
-        <w:tc>
-          <w:tcPr>
-            <w:tcW w:type="dxa" w:w="4500"/>
-          </w:tcPr>
-          <w:p>
-            <w:r>
-              <w:t xml:space="preserve">263</w:t>
-            </w:r>
-          </w:p>
-        </w:tc>
-        <w:tc>
-          <w:tcPr>
-            <w:tcW w:type="dxa" w:w="4500"/>
-          </w:tcPr>
-          <w:p>
-            <w:r>
-              <w:t xml:space="preserve">291</w:t>
-            </w:r>
-          </w:p>
-        </w:tc>
-      </w:tr>
-      <w:tr>
-        <w:tc>
-          <w:tcPr>
-            <w:tcW w:type="dxa" w:w="4500"/>
-          </w:tcPr>
-          <w:p>
-            <w:r>
-              <w:t xml:space="preserve">264</w:t>
-            </w:r>
-          </w:p>
-        </w:tc>
-        <w:tc>
-          <w:tcPr>
-            <w:tcW w:type="dxa" w:w="4500"/>
-          </w:tcPr>
-          <w:p>
-            <w:r>
-              <w:t xml:space="preserve">292</w:t>
-            </w:r>
-          </w:p>
-        </w:tc>
-      </w:tr>
-      <w:tr>
-        <w:tc>
-          <w:tcPr>
-            <w:tcW w:type="dxa" w:w="4500"/>
-          </w:tcPr>
-          <w:p>
-            <w:r>
-              <w:t xml:space="preserve">265</w:t>
-            </w:r>
-          </w:p>
-        </w:tc>
-        <w:tc>
-          <w:tcPr>
-            <w:tcW w:type="dxa" w:w="4500"/>
-          </w:tcPr>
-          <w:p>
-            <w:r>
-              <w:t xml:space="preserve">293</w:t>
-            </w:r>
-          </w:p>
-        </w:tc>
-      </w:tr>
-      <w:tr>
-        <w:tc>
-          <w:tcPr>
-            <w:tcW w:type="dxa" w:w="4500"/>
-          </w:tcPr>
-          <w:p>
-            <w:r>
-              <w:t xml:space="preserve">266</w:t>
-            </w:r>
-          </w:p>
-        </w:tc>
-        <w:tc>
-          <w:tcPr>
-            <w:tcW w:type="dxa" w:w="4500"/>
-          </w:tcPr>
-          <w:p>
-            <w:r>
-              <w:t xml:space="preserve">294</w:t>
-            </w:r>
-          </w:p>
-        </w:tc>
-      </w:tr>
-      <w:tr>
-        <w:tc>
-          <w:tcPr>
-            <w:tcW w:type="dxa" w:w="4500"/>
-          </w:tcPr>
-          <w:p>
-            <w:r>
-              <w:t xml:space="preserve">267</w:t>
-            </w:r>
-          </w:p>
-        </w:tc>
-        <w:tc>
-          <w:tcPr>
-            <w:tcW w:type="dxa" w:w="4500"/>
-          </w:tcPr>
-          <w:p>
-            <w:r>
-              <w:t xml:space="preserve">295</w:t>
-            </w:r>
-          </w:p>
-        </w:tc>
-      </w:tr>
-      <w:tr>
-        <w:tc>
-          <w:tcPr>
-            <w:tcW w:type="dxa" w:w="4500"/>
-          </w:tcPr>
-          <w:p>
-            <w:r>
-              <w:t xml:space="preserve">268</w:t>
-            </w:r>
-          </w:p>
-        </w:tc>
-        <w:tc>
-          <w:tcPr>
-            <w:tcW w:type="dxa" w:w="4500"/>
-          </w:tcPr>
-          <w:p>
-            <w:r>
-              <w:t xml:space="preserve">296</w:t>
-            </w:r>
-          </w:p>
-        </w:tc>
-      </w:tr>
-      <w:tr>
-        <w:tc>
-          <w:tcPr>
-            <w:tcW w:type="dxa" w:w="4500"/>
-          </w:tcPr>
-          <w:p>
-            <w:r>
-              <w:t xml:space="preserve">269</w:t>
-            </w:r>
-          </w:p>
-        </w:tc>
-        <w:tc>
-          <w:tcPr>
-            <w:tcW w:type="dxa" w:w="4500"/>
-          </w:tcPr>
-          <w:p>
-            <w:r>
-              <w:t xml:space="preserve">297</w:t>
-            </w:r>
-          </w:p>
-        </w:tc>
-      </w:tr>
-      <w:tr>
-        <w:tc>
-          <w:tcPr>
-            <w:tcW w:type="dxa" w:w="4500"/>
-          </w:tcPr>
-          <w:p>
-            <w:r>
-              <w:t xml:space="preserve">270</w:t>
-            </w:r>
-          </w:p>
-        </w:tc>
-        <w:tc>
-          <w:tcPr>
-            <w:tcW w:type="dxa" w:w="4500"/>
-          </w:tcPr>
-          <w:p>
-            <w:r>
-              <w:t xml:space="preserve">298</w:t>
-            </w:r>
-          </w:p>
-        </w:tc>
-      </w:tr>
-      <w:tr>
-        <w:tc>
-          <w:tcPr>
-            <w:tcW w:type="dxa" w:w="4500"/>
-          </w:tcPr>
-          <w:p>
-            <w:r>
-              <w:t xml:space="preserve">271</w:t>
-            </w:r>
-          </w:p>
-        </w:tc>
-        <w:tc>
-          <w:tcPr>
-            <w:tcW w:type="dxa" w:w="4500"/>
-          </w:tcPr>
-          <w:p>
-            <w:r>
-              <w:t xml:space="preserve">299</w:t>
-            </w:r>
-          </w:p>
-        </w:tc>
-      </w:tr>
-      <w:tr>
-        <w:tc>
-          <w:tcPr>
-            <w:tcW w:type="dxa" w:w="4500"/>
-          </w:tcPr>
-          <w:p>
-            <w:r>
-              <w:t xml:space="preserve">272</w:t>
-            </w:r>
-          </w:p>
-        </w:tc>
-        <w:tc>
-          <w:tcPr>
-            <w:tcW w:type="dxa" w:w="4500"/>
-          </w:tcPr>
-          <w:p>
-            <w:r>
-              <w:t xml:space="preserve">300</w:t>
-            </w:r>
-          </w:p>
-        </w:tc>
-      </w:tr>
-      <w:tr>
-        <w:tc>
-          <w:tcPr>
-            <w:tcW w:type="dxa" w:w="4500"/>
-          </w:tcPr>
-          <w:p>
-            <w:r>
-              <w:t xml:space="preserve">273</w:t>
-            </w:r>
-          </w:p>
-        </w:tc>
-        <w:tc>
-          <w:tcPr>
-            <w:tcW w:type="dxa" w:w="4500"/>
-          </w:tcPr>
-          <w:p>
-            <w:r>
-              <w:t xml:space="preserve">301</w:t>
-            </w:r>
-          </w:p>
-        </w:tc>
-      </w:tr>
-      <w:tr>
-        <w:tc>
-          <w:tcPr>
-            <w:tcW w:type="dxa" w:w="4500"/>
-          </w:tcPr>
-          <w:p>
-            <w:r>
-              <w:t xml:space="preserve">274</w:t>
-            </w:r>
-          </w:p>
-        </w:tc>
-        <w:tc>
-          <w:tcPr>
-            <w:tcW w:type="dxa" w:w="4500"/>
-          </w:tcPr>
-          <w:p>
-            <w:r>
-              <w:t xml:space="preserve">302</w:t>
-            </w:r>
-          </w:p>
-        </w:tc>
-      </w:tr>
-      <w:tr>
-        <w:tc>
-          <w:tcPr>
-            <w:tcW w:type="dxa" w:w="4500"/>
-          </w:tcPr>
-          <w:p>
-            <w:r>
-              <w:t xml:space="preserve">275</w:t>
-            </w:r>
-          </w:p>
-        </w:tc>
-        <w:tc>
-          <w:tcPr>
-            <w:tcW w:type="dxa" w:w="4500"/>
-          </w:tcPr>
-          <w:p>
-            <w:r>
-              <w:t xml:space="preserve">303</w:t>
-            </w:r>
-          </w:p>
-        </w:tc>
-      </w:tr>
-      <w:tr>
-        <w:tc>
-          <w:tcPr>
-            <w:tcW w:type="dxa" w:w="4500"/>
-          </w:tcPr>
-          <w:p>
-            <w:r>
-              <w:t xml:space="preserve">276</w:t>
-            </w:r>
-          </w:p>
-        </w:tc>
-        <w:tc>
-          <w:tcPr>
-            <w:tcW w:type="dxa" w:w="4500"/>
-          </w:tcPr>
-          <w:p>
-            <w:r>
-              <w:t xml:space="preserve">304</w:t>
-            </w:r>
-          </w:p>
-        </w:tc>
-      </w:tr>
-      <w:tr>
-        <w:tc>
-          <w:tcPr>
-            <w:tcW w:type="dxa" w:w="4500"/>
-          </w:tcPr>
-          <w:p>
-            <w:r>
-              <w:t xml:space="preserve">277</w:t>
-            </w:r>
-          </w:p>
-        </w:tc>
-        <w:tc>
-          <w:tcPr>
-            <w:tcW w:type="dxa" w:w="4500"/>
-          </w:tcPr>
-          <w:p>
-            <w:r>
-              <w:t xml:space="preserve">305</w:t>
-            </w:r>
-          </w:p>
-        </w:tc>
-      </w:tr>
-      <w:tr>
-        <w:tc>
-          <w:tcPr>
-            <w:tcW w:type="dxa" w:w="4500"/>
-          </w:tcPr>
-          <w:p>
-            <w:r>
-              <w:t xml:space="preserve">278</w:t>
-            </w:r>
-          </w:p>
-        </w:tc>
-        <w:tc>
-          <w:tcPr>
-            <w:tcW w:type="dxa" w:w="4500"/>
-          </w:tcPr>
-          <w:p>
-            <w:r>
-              <w:t xml:space="preserve">306</w:t>
-            </w:r>
-          </w:p>
-        </w:tc>
-      </w:tr>
-      <w:tr>
-        <w:tc>
-          <w:tcPr>
-            <w:tcW w:type="dxa" w:w="4500"/>
-          </w:tcPr>
-          <w:p>
-            <w:r>
-              <w:t xml:space="preserve">279</w:t>
-            </w:r>
-          </w:p>
-        </w:tc>
-        <w:tc>
-          <w:tcPr>
-            <w:tcW w:type="dxa" w:w="4500"/>
-          </w:tcPr>
-          <w:p>
-            <w:r>
-              <w:t xml:space="preserve">307</w:t>
-            </w:r>
-          </w:p>
-        </w:tc>
-      </w:tr>
-      <w:tr>
-        <w:tc>
-          <w:tcPr>
-            <w:tcW w:type="dxa" w:w="4500"/>
-          </w:tcPr>
-          <w:p>
-            <w:r>
-              <w:t xml:space="preserve">280</w:t>
-            </w:r>
-          </w:p>
-        </w:tc>
-        <w:tc>
-          <w:tcPr>
-            <w:tcW w:type="dxa" w:w="4500"/>
-          </w:tcPr>
-          <w:p>
-            <w:r>
-              <w:t xml:space="preserve">308</w:t>
-            </w:r>
-          </w:p>
-        </w:tc>
-      </w:tr>
-      <w:tr>
-        <w:tc>
-          <w:tcPr>
-            <w:tcW w:type="dxa" w:w="4500"/>
-          </w:tcPr>
-          <w:p>
-            <w:r>
-              <w:t xml:space="preserve">281</w:t>
-            </w:r>
-          </w:p>
-        </w:tc>
-        <w:tc>
-          <w:tcPr>
-            <w:tcW w:type="dxa" w:w="4500"/>
-          </w:tcPr>
-          <w:p>
-            <w:r>
-              <w:t xml:space="preserve">309</w:t>
-            </w:r>
-          </w:p>
-        </w:tc>
-      </w:tr>
-      <w:tr>
-        <w:tc>
-          <w:tcPr>
-            <w:tcW w:type="dxa" w:w="4500"/>
-          </w:tcPr>
-          <w:p>
-            <w:r>
-              <w:t xml:space="preserve">282</w:t>
-            </w:r>
-          </w:p>
-        </w:tc>
-        <w:tc>
-          <w:tcPr>
-            <w:tcW w:type="dxa" w:w="4500"/>
-          </w:tcPr>
-          <w:p>
-            <w:r>
-              <w:t xml:space="preserve">310</w:t>
-            </w:r>
-          </w:p>
-        </w:tc>
-      </w:tr>
-      <w:tr>
-        <w:tc>
-          <w:tcPr>
-            <w:tcW w:type="dxa" w:w="4500"/>
-          </w:tcPr>
-          <w:p>
-            <w:r>
-              <w:t xml:space="preserve">283</w:t>
-            </w:r>
-          </w:p>
-        </w:tc>
-        <w:tc>
-          <w:tcPr>
-            <w:tcW w:type="dxa" w:w="4500"/>
-          </w:tcPr>
-          <w:p>
-            <w:r>
-              <w:t xml:space="preserve">311</w:t>
-            </w:r>
-          </w:p>
-        </w:tc>
-      </w:tr>
-      <w:tr>
-        <w:tc>
-          <w:tcPr>
-            <w:tcW w:type="dxa" w:w="4500"/>
-          </w:tcPr>
-          <w:p>
-            <w:r>
-              <w:t xml:space="preserve">284</w:t>
-            </w:r>
-          </w:p>
-        </w:tc>
-        <w:tc>
-          <w:tcPr>
-            <w:tcW w:type="dxa" w:w="4500"/>
-          </w:tcPr>
-          <w:p>
-            <w:r>
-              <w:t xml:space="preserve">312</w:t>
-            </w:r>
-          </w:p>
-        </w:tc>
-      </w:tr>
-      <w:tr>
-        <w:tc>
-          <w:tcPr>
-            <w:tcW w:type="dxa" w:w="4500"/>
-          </w:tcPr>
-          <w:p>
-            <w:r>
-              <w:t xml:space="preserve">285</w:t>
-            </w:r>
-          </w:p>
-        </w:tc>
-        <w:tc>
-          <w:tcPr>
-            <w:tcW w:type="dxa" w:w="4500"/>
-          </w:tcPr>
-          <w:p>
-            <w:r>
-              <w:t xml:space="preserve">313</w:t>
-            </w:r>
-          </w:p>
-        </w:tc>
-      </w:tr>
-      <w:tr>
-        <w:tc>
-          <w:tcPr>
-            <w:tcW w:type="dxa" w:w="4500"/>
-          </w:tcPr>
-          <w:p>
-            <w:r>
-              <w:t xml:space="preserve">286</w:t>
-            </w:r>
-          </w:p>
-        </w:tc>
-        <w:tc>
-          <w:tcPr>
-            <w:tcW w:type="dxa" w:w="4500"/>
-          </w:tcPr>
-          <w:p>
-            <w:r>
-              <w:t xml:space="preserve">314</w:t>
+        <w:tc>
+          <w:tcPr>
+            <w:tcW w:type="dxa" w:w="4500"/>
+          </w:tcPr>
+          <w:p>
+            <w:r>
+              <w:t>319</w:t>
             </w:r>
           </w:p>
         </w:tc>

</xml_diff>